<commit_message>
New icons for animations
</commit_message>
<xml_diff>
--- a/docs/fotobox_dokumentation.docx
+++ b/docs/fotobox_dokumentation.docx
@@ -21,14 +21,36 @@
       <w:pPr>
         <w:spacing w:after="400"/>
         <w:jc w:val="center"/>
+        <w:rPr>
+          <w:lang w:val="en-US"/>
+        </w:rPr>
       </w:pPr>
       <w:r>
         <w:rPr>
           <w:i/>
           <w:iCs/>
           <w:color w:val="555555"/>
-        </w:rPr>
-        <w:t>Stand: 3. August 2026 · Raspberry Pi 5, Debian trixie</w:t>
+          <w:lang w:val="en-US"/>
+        </w:rPr>
+        <w:t xml:space="preserve">Stand: </w:t>
+      </w:r>
+      <w:r>
+        <w:rPr>
+          <w:i/>
+          <w:iCs/>
+          <w:color w:val="555555"/>
+          <w:lang w:val="en-US"/>
+        </w:rPr>
+        <w:t>5. August</w:t>
+      </w:r>
+      <w:r>
+        <w:rPr>
+          <w:i/>
+          <w:iCs/>
+          <w:color w:val="555555"/>
+          <w:lang w:val="en-US"/>
+        </w:rPr>
+        <w:t xml:space="preserve"> 2026</w:t>
       </w:r>
     </w:p>
     <w:p>
@@ -83,13 +105,7 @@
         <w:spacing w:after="160"/>
       </w:pPr>
       <w:r>
-        <w:t xml:space="preserve">Die Software steuert Peripherie und Benutzeroberfläche als unidirektionale State Machine: jedes Ereignis (Touch, Taster, Timer) wird gegen den aktuellen AppState geprüft und liefert ein neues Modell plus auszuführende Aktionen zurück. Die folgende Liste nennt die tatsächlichen Zustandsnamen aus </w:t>
-      </w:r>
-      <w:r>
-        <w:t xml:space="preserve">states.py </w:t>
-      </w:r>
-      <w:r>
-        <w:t>(autoritativ) mit ihrer Bedeutung für den Gast-Ablauf.</w:t>
+        <w:t>Die Software steuert Peripherie und Benutzeroberfläche als unidirektionale State Machine: jedes Ereignis (Touch, Taster, Timer) wird gegen den aktuellen AppState geprüft und liefert ein neues Modell plus auszuführende Aktionen zurück. Die folgende Liste nennt die tatsächlichen Zustandsnamen aus states.py (autoritativ) mit ihrer Bedeutung für den Gast-Ablauf.</w:t>
       </w:r>
     </w:p>
     <w:tbl>
@@ -740,14 +756,7 @@
                 <w:sz w:val="19"/>
                 <w:szCs w:val="19"/>
               </w:rPr>
-              <w:t xml:space="preserve">Sicherheitsabfrage vor dem Löschen des aktuellen Fotos. LED-Ring: rotes Blinken. 30s ohne Interaktion → automatisches Löschen, zurück </w:t>
-            </w:r>
-            <w:r>
-              <w:rPr>
-                <w:sz w:val="19"/>
-                <w:szCs w:val="19"/>
-              </w:rPr>
-              <w:t>in einen neuen COUNTDOWN (seit der Sprint-11-Nachbesserung; vorher MAIN_MENU) - der Gast wollte in aller Regel gleich ein neues Foto aufnehmen.</w:t>
+              <w:t>Sicherheitsabfrage vor dem Löschen des aktuellen Fotos. LED-Ring: rotes Blinken. 30s ohne Interaktion → automatisches Löschen, zurück zu MAIN_MENU.</w:t>
             </w:r>
           </w:p>
         </w:tc>
@@ -1085,13 +1094,7 @@
         <w:spacing w:after="90"/>
       </w:pPr>
       <w:r>
-        <w:t xml:space="preserve">Bei korrekter PIN erscheint der Abschieds-Screen mit einer Sonnenuntergangs-Animation am LED-Ring (ca. 9 Sekunden, led_shutdown.py); danach führt die App </w:t>
-      </w:r>
-      <w:r>
-        <w:t>shutdown -h</w:t>
-      </w:r>
-      <w:r>
-        <w:t xml:space="preserve"> now aus.</w:t>
+        <w:t>Bei korrekter PIN erscheint der Abschieds-Screen mit einer Sonnenuntergangs-Animation am LED-Ring (ca. 9 Sekunden, led_shutdown.py); danach führt die App shutdown -h now aus.</w:t>
       </w:r>
     </w:p>
     <w:p>
@@ -1199,13 +1202,7 @@
         <w:spacing w:after="160"/>
       </w:pPr>
       <w:r>
-        <w:t xml:space="preserve">Die drei Geste-Werte sind optional (Fallback in </w:t>
-      </w:r>
-      <w:r>
-        <w:t>config.py</w:t>
-      </w:r>
-      <w:r>
-        <w:t>); nur die PIN ist Pflicht. Nicht-geheime Parameter (Sperr-Zeiten, Farben der Fehler-Optik, Animationsdauer goodbye_seconds) stehen in config.py in der Unter-Config ShutdownConfig.</w:t>
+        <w:t>Die drei Geste-Werte sind optional (Fallback in config.py); nur die PIN ist Pflicht. Nicht-geheime Parameter (Sperr-Zeiten, Farben der Fehler-Optik, Animationsdauer goodbye_seconds) stehen in config.py in der Unter-Config ShutdownConfig.</w:t>
       </w:r>
     </w:p>
     <w:p>
@@ -1222,13 +1219,7 @@
         <w:spacing w:after="160"/>
       </w:pPr>
       <w:r>
-        <w:t xml:space="preserve">Nach max_pin_attempts Fehlversuchen (Standard 3) wird für lockout_seconds (Standard 30 Minuten) gesperrt. Zähler und Sperre liegen in </w:t>
-      </w:r>
-      <w:r>
-        <w:t>data/shutdown_lockout.json</w:t>
-      </w:r>
-      <w:r>
-        <w:t xml:space="preserve"> und überstehen einen Neustart, ein Reboot hebt die Sperre also nicht auf (Schutz gegen Reboot-Bypass). Von Hand zurücksetzen:</w:t>
+        <w:t>Nach max_pin_attempts Fehlversuchen (Standard 3) wird für lockout_seconds (Standard 30 Minuten) gesperrt. Zähler und Sperre liegen in data/shutdown_lockout.json und überstehen einen Neustart, ein Reboot hebt die Sperre also nicht auf (Schutz gegen Reboot-Bypass). Von Hand zurücksetzen:</w:t>
       </w:r>
     </w:p>
     <w:p>
@@ -1282,10 +1273,7 @@
         <w:spacing w:after="160"/>
       </w:pPr>
       <w:r>
-        <w:t>app_with_hw.py</w:t>
-      </w:r>
-      <w:r>
-        <w:t xml:space="preserve"> läuft ohnehin als root, daher genügt der direkte shutdown-Aufruf; die restriktive sudoers-Regel muss dafür nicht erweitert werden. Ein während der Entwicklung genutzter Debug-Hotkey wurde für den Produktivbetrieb bewusst wieder entfernt, damit im Code keine Abkürzung in den Shutdown-Pfad verbleibt. Der einzige Weg ist Geste, dann PIN, dann Sperre.</w:t>
+        <w:t>app_with_hw.py läuft ohnehin als root, daher genügt der direkte shutdown-Aufruf; die restriktive sudoers-Regel muss dafür nicht erweitert werden. Ein während der Entwicklung genutzter Debug-Hotkey wurde für den Produktivbetrieb bewusst wieder entfernt, damit im Code keine Abkürzung in den Shutdown-Pfad verbleibt. Der einzige Weg ist Geste, dann PIN, dann Sperre.</w:t>
       </w:r>
     </w:p>
     <w:p>
@@ -1301,13 +1289,7 @@
         <w:spacing w:after="160"/>
       </w:pPr>
       <w:r>
-        <w:t xml:space="preserve">Über die versteckte Geste plus PIN erreichbar (siehe voriges Kapitel). Sieben Punkte im festen 2×4-Raster (seit Sprint 11 — vorher 2×3, siehe „Kamera-Einstellungen“ unten; die neue Zeile wurde bewusst oberhalb von „Zurück“/„Alle Bilder löschen“ eingefügt, damit deren Eck-Platzierung unverändert bleibt), zentral definiert in </w:t>
-      </w:r>
-      <w:r>
-        <w:t>admin_menu.py</w:t>
-      </w:r>
-      <w:r>
-        <w:t xml:space="preserve"> (Beschriftung, Rasterposition, Farbe und ausgelöstes Event an einer Stelle, damit Renderer und Treffererkennung nicht auseinanderlaufen können).</w:t>
+        <w:t>Über die versteckte Geste plus PIN erreichbar (siehe voriges Kapitel). Sieben Punkte im festen 2×4-Raster (seit Sprint 11 — vorher 2×3, siehe „Kamera-Einstellungen“ unten; die neue Zeile wurde bewusst oberhalb von „Zurück“/„Alle Bilder löschen“ eingefügt, damit deren Eck-Platzierung unverändert bleibt), zentral definiert in admin_menu.py (Beschriftung, Rasterposition, Farbe und ausgelöstes Event an einer Stelle, damit Renderer und Treffererkennung nicht auseinanderlaufen können).</w:t>
       </w:r>
     </w:p>
     <w:tbl>
@@ -1503,20 +1485,7 @@
                 <w:sz w:val="19"/>
                 <w:szCs w:val="19"/>
               </w:rPr>
-              <w:t xml:space="preserve">Kurzer Zwischenscreen, danach beendet sich die App — </w:t>
-            </w:r>
-            <w:r>
-              <w:rPr>
-                <w:sz w:val="19"/>
-              </w:rPr>
-              <w:t>start_fotobox.sh</w:t>
-            </w:r>
-            <w:r>
-              <w:rPr>
-                <w:sz w:val="19"/>
-                <w:szCs w:val="19"/>
-              </w:rPr>
-              <w:t xml:space="preserve"> startet automatisch neu.</w:t>
+              <w:t>Kurzer Zwischenscreen, danach beendet sich die App — start_fotobox.sh startet automatisch neu.</w:t>
             </w:r>
           </w:p>
         </w:tc>
@@ -1600,48 +1569,7 @@
                 <w:sz w:val="19"/>
                 <w:szCs w:val="19"/>
               </w:rPr>
-              <w:t>NEU (Sprint 11): ISO und Blende direkt über die bestehende USB-Verbindung anpassen (</w:t>
-            </w:r>
-            <w:r>
-              <w:rPr>
-                <w:sz w:val="19"/>
-              </w:rPr>
-              <w:t>hw_camera_settings_provider.py</w:t>
-            </w:r>
-            <w:r>
-              <w:rPr>
-                <w:sz w:val="19"/>
-                <w:szCs w:val="19"/>
-              </w:rPr>
-              <w:t xml:space="preserve">), ohne die Kamera aus dem Gehäuse zu nehmen, Kabel zu lösen und danach neu auszurichten. Gültige Werte werden live von der Kamera gelesen (abhängig vom montierten Objektiv), die Kamera </w:t>
-            </w:r>
-            <w:r>
-              <w:rPr>
-                <w:sz w:val="19"/>
-                <w:szCs w:val="19"/>
-              </w:rPr>
-              <w:t>sollte</w:t>
-            </w:r>
-            <w:r>
-              <w:rPr>
-                <w:sz w:val="19"/>
-                <w:szCs w:val="19"/>
-              </w:rPr>
-              <w:t xml:space="preserve"> im Modus </w:t>
-            </w:r>
-            <w:r>
-              <w:rPr>
-                <w:sz w:val="19"/>
-                <w:szCs w:val="19"/>
-              </w:rPr>
-              <w:t xml:space="preserve">A (Zeitautomatik) oder </w:t>
-            </w:r>
-            <w:r>
-              <w:rPr>
-                <w:sz w:val="19"/>
-                <w:szCs w:val="19"/>
-              </w:rPr>
-              <w:t>M stehen.</w:t>
+              <w:t>NEU (Sprint 11): ISO und Blende direkt über die bestehende USB-Verbindung anpassen (hw_camera_settings_provider.py), ohne die Kamera aus dem Gehäuse zu nehmen, Kabel zu lösen und danach neu auszurichten. Gültige Werte werden live von der Kamera gelesen (abhängig vom montierten Objektiv), die Kamera muss im Modus M stehen.</w:t>
             </w:r>
           </w:p>
         </w:tc>
@@ -1727,13 +1655,6 @@
               </w:rPr>
               <w:t>Löscht Fotos auf Pi und Kamera-Speicherkarte mit Protokoll; geschützte Dateien bleiben erhalten.</w:t>
             </w:r>
-            <w:r>
-              <w:rPr>
-                <w:sz w:val="19"/>
-                <w:szCs w:val="19"/>
-              </w:rPr>
-              <w:t xml:space="preserve"> Seit der Sprint-11-Nachbesserung begleitet eine Shredder-Animation (Bilddatei-Symbole fallen von oben in einen Shredder und kommen unten als Schnipsel heraus) zusätzlich zum Fortschrittsbalken den Löschlauf - rein optisch, ohne eigenen Bezug zu einzelnen tatsächlich gelöschten Dateien.</w:t>
-            </w:r>
           </w:p>
         </w:tc>
       </w:tr>
@@ -1751,13 +1672,7 @@
         <w:spacing w:after="160"/>
       </w:pPr>
       <w:r>
-        <w:t>Bei jedem Aufruf synchron ermittelt (</w:t>
-      </w:r>
-      <w:r>
-        <w:t>admin_diagnostics.py</w:t>
-      </w:r>
-      <w:r>
-        <w:t>), unabhängig voneinander — eine nicht erreichbare Quelle unterdrückt nicht die übrigen Zeilen:</w:t>
+        <w:t>Bei jedem Aufruf synchron ermittelt (admin_diagnostics.py), unabhängig voneinander — eine nicht erreichbare Quelle unterdrückt nicht die übrigen Zeilen:</w:t>
       </w:r>
     </w:p>
     <w:p>
@@ -1796,14 +1711,7 @@
         <w:spacing w:after="90"/>
       </w:pPr>
       <w:r>
-        <w:lastRenderedPageBreak/>
-        <w:t>Kamera-Verbindung (</w:t>
-      </w:r>
-      <w:r>
-        <w:t>gphoto2 --auto-detect</w:t>
-      </w:r>
-      <w:r>
-        <w:t>, ohne den laufenden Vorschau-Betrieb zu stören)</w:t>
+        <w:t>Kamera-Verbindung (gphoto2 --auto-detect, ohne den laufenden Vorschau-Betrieb zu stören)</w:t>
       </w:r>
     </w:p>
     <w:p>
@@ -1829,6 +1737,7 @@
         <w:spacing w:after="90"/>
       </w:pPr>
       <w:r>
+        <w:lastRenderedPageBreak/>
         <w:t>Vorhandensein aller geschützten Dateien (siehe unten), fehlende werden namentlich benannt</w:t>
       </w:r>
     </w:p>
@@ -1931,19 +1840,7 @@
         <w:spacing w:after="90"/>
       </w:pPr>
       <w:r>
-        <w:t xml:space="preserve">„Umbenennen“ (Standard, nicht-destruktiv): die vorhandene Datei auf dem Stick bleibt unangetastet, die neue Datei bekommt das Schema </w:t>
-      </w:r>
-      <w:r>
-        <w:t>name_001.jpg</w:t>
-      </w:r>
-      <w:r>
-        <w:t xml:space="preserve">, </w:t>
-      </w:r>
-      <w:r>
-        <w:t>name_002.jpg</w:t>
-      </w:r>
-      <w:r>
-        <w:t>, ...</w:t>
+        <w:t>„Umbenennen“ (Standard, nicht-destruktiv): die vorhandene Datei auf dem Stick bleibt unangetastet, die neue Datei bekommt das Schema name_001.jpg, name_002.jpg, ...</w:t>
       </w:r>
     </w:p>
     <w:p>
@@ -2013,19 +1910,7 @@
         <w:spacing w:after="160"/>
       </w:pPr>
       <w:r>
-        <w:t xml:space="preserve">Löscht an drei Orten: </w:t>
-      </w:r>
-      <w:r>
-        <w:t>data/photos/</w:t>
-      </w:r>
-      <w:r>
-        <w:t xml:space="preserve"> (Originale), </w:t>
-      </w:r>
-      <w:r>
-        <w:t>data/web/</w:t>
-      </w:r>
-      <w:r>
-        <w:t xml:space="preserve"> (exportierte Kopien für den QR-Download — leicht zu vergessen, aber über nginx im Gäste-WLAN erreichbar) und die Kamera-Speicherkarte per gphoto2. Jede Datei wird vor dem Entfernen einmal mit Nullen überschrieben (Best-Effort-Zusatz).</w:t>
+        <w:t>Löscht an drei Orten: data/photos/ (Originale), data/web/ (exportierte Kopien für den QR-Download — leicht zu vergessen, aber über nginx im Gäste-WLAN erreichbar) und die Kamera-Speicherkarte per gphoto2. Jede Datei wird vor dem Entfernen einmal mit Nullen überschrieben (Best-Effort-Zusatz).</w:t>
       </w:r>
     </w:p>
     <w:p>
@@ -2048,13 +1933,7 @@
         <w:spacing w:after="160"/>
       </w:pPr>
       <w:r>
-        <w:t xml:space="preserve">Ein Löschprotokoll wird ausschließlich lokal unter </w:t>
-      </w:r>
-      <w:r>
-        <w:t>data/logs/</w:t>
-      </w:r>
-      <w:r>
-        <w:t xml:space="preserve"> abgelegt (nicht auf einem USB-Stick) und listet jede gelöschte Datei mit Größe und Änderungszeitpunkt auf. Die vier geschützten Dateien (siehe unten) überleben jeden Löschlauf.</w:t>
+        <w:t>Ein Löschprotokoll wird ausschließlich lokal unter data/logs/ abgelegt (nicht auf einem USB-Stick) und listet jede gelöschte Datei mit Größe und Änderungszeitpunkt auf. Die vier geschützten Dateien (siehe unten) überleben jeden Löschlauf.</w:t>
       </w:r>
     </w:p>
     <w:p>
@@ -2070,10 +1949,7 @@
         <w:spacing w:after="160"/>
       </w:pPr>
       <w:r>
-        <w:t>storage_alarm.py</w:t>
-      </w:r>
-      <w:r>
-        <w:t xml:space="preserve"> prüft periodisch (Standard alle 30 Sekunden) den freien Speicherplatz und leitet daraus eine von drei Alarmstufen ab. Die durchschnittliche Fotogröße für die Rest-Kapazitäts-Schätzung wird aus den tatsächlich vorhandenen Fotos berechnet; existieren noch keine, greift ein konfigurierbarer Erfahrungswert (Standard 13 MB, aus einer echten Veranstaltung: 775 MB bei 63 Aufnahmen).</w:t>
+        <w:t>storage_alarm.py prüft periodisch (Standard alle 30 Sekunden) den freien Speicherplatz und leitet daraus eine von drei Alarmstufen ab. Die durchschnittliche Fotogröße für die Rest-Kapazitäts-Schätzung wird aus den tatsächlich vorhandenen Fotos berechnet; existieren noch keine, greift ein konfigurierbarer Erfahrungswert (Standard 13 MB, aus einer echten Veranstaltung: 775 MB bei 63 Aufnahmen).</w:t>
       </w:r>
     </w:p>
     <w:tbl>
@@ -2313,48 +2189,55 @@
                 <w:sz w:val="19"/>
                 <w:szCs w:val="19"/>
               </w:rPr>
+              <w:t>2 — kritisch</w:t>
+            </w:r>
+          </w:p>
+        </w:tc>
+        <w:tc>
+          <w:tcPr>
+            <w:tcW w:w="1700" w:type="dxa"/>
+            <w:tcMar>
+              <w:top w:w="60" w:type="dxa"/>
+              <w:left w:w="100" w:type="dxa"/>
+              <w:bottom w:w="60" w:type="dxa"/>
+              <w:right w:w="100" w:type="dxa"/>
+            </w:tcMar>
+          </w:tcPr>
+          <w:p>
+            <w:r>
+              <w:rPr>
+                <w:sz w:val="19"/>
+                <w:szCs w:val="19"/>
+              </w:rPr>
+              <w:t>≤ 5% frei</w:t>
+            </w:r>
+          </w:p>
+        </w:tc>
+        <w:tc>
+          <w:tcPr>
+            <w:tcW w:w="5300" w:type="dxa"/>
+            <w:tcMar>
+              <w:top w:w="60" w:type="dxa"/>
+              <w:left w:w="100" w:type="dxa"/>
+              <w:bottom w:w="60" w:type="dxa"/>
+              <w:right w:w="100" w:type="dxa"/>
+            </w:tcMar>
+          </w:tcPr>
+          <w:p>
+            <w:r>
+              <w:rPr>
+                <w:sz w:val="19"/>
+                <w:szCs w:val="19"/>
+              </w:rPr>
+              <w:t>Keine neuen Aufnahmen mehr möglich (Sperre auf MAIN_MENU und GALLERY_EMPTY); Bildschirm zeigt einen blinkenden roten Rahmen mit dem Text „ACHTUNG: Bitte Techniker rufen!“, LED-</w:t>
+            </w:r>
+            <w:r>
+              <w:rPr>
+                <w:sz w:val="19"/>
+                <w:szCs w:val="19"/>
+              </w:rPr>
               <w:lastRenderedPageBreak/>
-              <w:t>2 — kritisch</w:t>
-            </w:r>
-          </w:p>
-        </w:tc>
-        <w:tc>
-          <w:tcPr>
-            <w:tcW w:w="1700" w:type="dxa"/>
-            <w:tcMar>
-              <w:top w:w="60" w:type="dxa"/>
-              <w:left w:w="100" w:type="dxa"/>
-              <w:bottom w:w="60" w:type="dxa"/>
-              <w:right w:w="100" w:type="dxa"/>
-            </w:tcMar>
-          </w:tcPr>
-          <w:p>
-            <w:r>
-              <w:rPr>
-                <w:sz w:val="19"/>
-                <w:szCs w:val="19"/>
-              </w:rPr>
-              <w:t>≤ 5% frei</w:t>
-            </w:r>
-          </w:p>
-        </w:tc>
-        <w:tc>
-          <w:tcPr>
-            <w:tcW w:w="5300" w:type="dxa"/>
-            <w:tcMar>
-              <w:top w:w="60" w:type="dxa"/>
-              <w:left w:w="100" w:type="dxa"/>
-              <w:bottom w:w="60" w:type="dxa"/>
-              <w:right w:w="100" w:type="dxa"/>
-            </w:tcMar>
-          </w:tcPr>
-          <w:p>
-            <w:r>
-              <w:rPr>
-                <w:sz w:val="19"/>
-                <w:szCs w:val="19"/>
-              </w:rPr>
-              <w:t>Keine neuen Aufnahmen mehr möglich (Sperre auf MAIN_MENU und GALLERY_EMPTY); Bildschirm zeigt einen blinkenden roten Rahmen mit dem Text „ACHTUNG: Bitte Techniker rufen!“, LED-Ring erzwingt schnelles Rot-Blinken (5 Hz, derselbe Effekt wie ERROR_SCREEN).</w:t>
+              <w:t>Ring erzwingt schnelles Rot-Blinken (5 Hz, derselbe Effekt wie ERROR_SCREEN).</w:t>
             </w:r>
           </w:p>
         </w:tc>
@@ -2365,6 +2248,7 @@
         <w:spacing w:after="160"/>
       </w:pPr>
       <w:r>
+        <w:lastRenderedPageBreak/>
         <w:t>Die Sperre betrifft ausschließlich das Starten einer NEUEN Aufnahme — bereits vorhandene Fotos können weiterhin angesehen und über das Service-Menü gelöscht werden (was ja Platz schafft). Sobald wieder ausreichend Speicher frei ist, verschwindet die Sperre automatisch bei der nächsten periodischen Prüfung, ohne App-Neustart.</w:t>
       </w:r>
     </w:p>
@@ -2402,13 +2286,7 @@
         <w:spacing w:after="160"/>
       </w:pPr>
       <w:r>
-        <w:t xml:space="preserve">Titel, Foto-Präfix und Gäste-WLAN-Passwort ändern sich mit jeder Veranstaltung und liegen daher nicht im Code, sondern in </w:t>
-      </w:r>
-      <w:r>
-        <w:t>event_config.json</w:t>
-      </w:r>
-      <w:r>
-        <w:t xml:space="preserve"> im Hauptverzeichnis (nicht versioniert, analog zu local_secrets.py — beide sind „Setup-Dateien“, die von Hand vor jedem Event angepasst werden, im Unterschied zu Laufzeitdaten unter data/).</w:t>
+        <w:t>Titel, Foto-Präfix und Gäste-WLAN-Passwort ändern sich mit jeder Veranstaltung und liegen daher nicht im Code, sondern in event_config.json im Hauptverzeichnis (nicht versioniert, analog zu local_secrets.py — beide sind „Setup-Dateien“, die von Hand vor jedem Event angepasst werden, im Unterschied zu Laufzeitdaten unter data/).</w:t>
       </w:r>
     </w:p>
     <w:p>
@@ -2421,16 +2299,18 @@
       </w:pPr>
       <w:r>
         <w:rPr>
-          <w:rFonts w:ascii="Consolas" w:hAnsi="Consolas"/>
-          <w:sz w:val="19"/>
+          <w:rFonts w:ascii="Consolas" w:eastAsia="Consolas" w:hAnsi="Consolas" w:cs="Consolas"/>
+          <w:sz w:val="19"/>
+          <w:szCs w:val="19"/>
           <w:lang w:val="en-US"/>
         </w:rPr>
         <w:t>cp event_config_example.json event_config.json</w:t>
       </w:r>
       <w:r>
         <w:rPr>
-          <w:rFonts w:ascii="Consolas" w:hAnsi="Consolas"/>
-          <w:sz w:val="19"/>
+          <w:rFonts w:ascii="Consolas" w:eastAsia="Consolas" w:hAnsi="Consolas" w:cs="Consolas"/>
+          <w:sz w:val="19"/>
+          <w:szCs w:val="19"/>
           <w:lang w:val="en-US"/>
         </w:rPr>
         <w:br/>
@@ -2444,16 +2324,18 @@
       </w:pPr>
       <w:r>
         <w:rPr>
-          <w:rFonts w:ascii="Consolas" w:hAnsi="Consolas"/>
-          <w:sz w:val="19"/>
+          <w:rFonts w:ascii="Consolas" w:eastAsia="Consolas" w:hAnsi="Consolas" w:cs="Consolas"/>
+          <w:sz w:val="19"/>
+          <w:szCs w:val="19"/>
           <w:lang w:val="en-US"/>
         </w:rPr>
         <w:t>{</w:t>
       </w:r>
       <w:r>
         <w:rPr>
-          <w:rFonts w:ascii="Consolas" w:hAnsi="Consolas"/>
-          <w:sz w:val="19"/>
+          <w:rFonts w:ascii="Consolas" w:eastAsia="Consolas" w:hAnsi="Consolas" w:cs="Consolas"/>
+          <w:sz w:val="19"/>
+          <w:szCs w:val="19"/>
           <w:lang w:val="en-US"/>
         </w:rPr>
         <w:br/>
@@ -2461,8 +2343,9 @@
       </w:r>
       <w:r>
         <w:rPr>
-          <w:rFonts w:ascii="Consolas" w:hAnsi="Consolas"/>
-          <w:sz w:val="19"/>
+          <w:rFonts w:ascii="Consolas" w:eastAsia="Consolas" w:hAnsi="Consolas" w:cs="Consolas"/>
+          <w:sz w:val="19"/>
+          <w:szCs w:val="19"/>
           <w:lang w:val="en-US"/>
         </w:rPr>
         <w:br/>
@@ -2470,8 +2353,9 @@
       </w:r>
       <w:r>
         <w:rPr>
-          <w:rFonts w:ascii="Consolas" w:hAnsi="Consolas"/>
-          <w:sz w:val="19"/>
+          <w:rFonts w:ascii="Consolas" w:eastAsia="Consolas" w:hAnsi="Consolas" w:cs="Consolas"/>
+          <w:sz w:val="19"/>
+          <w:szCs w:val="19"/>
           <w:lang w:val="en-US"/>
         </w:rPr>
         <w:br/>
@@ -2479,16 +2363,18 @@
       </w:r>
       <w:r>
         <w:rPr>
-          <w:rFonts w:ascii="Consolas" w:hAnsi="Consolas"/>
-          <w:sz w:val="19"/>
+          <w:rFonts w:ascii="Consolas" w:eastAsia="Consolas" w:hAnsi="Consolas" w:cs="Consolas"/>
+          <w:sz w:val="19"/>
+          <w:szCs w:val="19"/>
           <w:lang w:val="en-US"/>
         </w:rPr>
         <w:br/>
       </w:r>
       <w:r>
         <w:rPr>
-          <w:rFonts w:ascii="Consolas" w:hAnsi="Consolas"/>
-          <w:sz w:val="19"/>
+          <w:rFonts w:ascii="Consolas" w:eastAsia="Consolas" w:hAnsi="Consolas" w:cs="Consolas"/>
+          <w:sz w:val="19"/>
+          <w:szCs w:val="19"/>
         </w:rPr>
         <w:t>}</w:t>
       </w:r>
@@ -2740,20 +2626,7 @@
                 <w:sz w:val="19"/>
                 <w:szCs w:val="19"/>
               </w:rPr>
-              <w:t xml:space="preserve">Diagnosebild, per nginx unter </w:t>
-            </w:r>
-            <w:r>
-              <w:rPr>
-                <w:sz w:val="19"/>
-              </w:rPr>
-              <w:t>/fotos/testbild.png</w:t>
-            </w:r>
-            <w:r>
-              <w:rPr>
-                <w:sz w:val="19"/>
-                <w:szCs w:val="19"/>
-              </w:rPr>
-              <w:t xml:space="preserve"> erreichbar, nirgends in der App sichtbar.</w:t>
+              <w:t>Diagnosebild, per nginx unter /fotos/testbild.png erreichbar, nirgends in der App sichtbar.</w:t>
             </w:r>
           </w:p>
         </w:tc>
@@ -2780,25 +2653,7 @@
         <w:spacing w:after="160"/>
       </w:pPr>
       <w:r>
-        <w:t>Diese Tabelle bildet den tatsächlichen Code-Stand ab (</w:t>
-      </w:r>
-      <w:r>
-        <w:t>app_with_hw.py::_sync_led / _sync_button_led</w:t>
-      </w:r>
-      <w:r>
-        <w:t xml:space="preserve">, </w:t>
-      </w:r>
-      <w:r>
-        <w:t>led_service.py</w:t>
-      </w:r>
-      <w:r>
-        <w:t xml:space="preserve">, </w:t>
-      </w:r>
-      <w:r>
-        <w:t>hw_led_provider.py</w:t>
-      </w:r>
-      <w:r>
-        <w:t>) und wird bei jeder neuen LED-relevanten Änderung aktualisiert.</w:t>
+        <w:t>Diese Tabelle bildet den tatsächlichen Code-Stand ab (app_with_hw.py::_sync_led / _sync_button_led, led_service.py, hw_led_provider.py) und wird bei jeder neuen LED-relevanten Änderung aktualisiert.</w:t>
       </w:r>
     </w:p>
     <w:tbl>
@@ -2979,9 +2834,9 @@
             <w:r>
               <w:rPr>
                 <w:sz w:val="19"/>
+                <w:szCs w:val="19"/>
                 <w:lang w:val="en-US"/>
               </w:rPr>
-              <w:lastRenderedPageBreak/>
               <w:t>MAIN_MENU, ATTRACT_GALLERY, TERMS</w:t>
             </w:r>
           </w:p>
@@ -3044,6 +2899,7 @@
                 <w:sz w:val="19"/>
                 <w:szCs w:val="19"/>
               </w:rPr>
+              <w:lastRenderedPageBreak/>
               <w:t>GALLERY_GRID</w:t>
             </w:r>
           </w:p>
@@ -3977,6 +3833,7 @@
             <w:r>
               <w:rPr>
                 <w:sz w:val="19"/>
+                <w:szCs w:val="19"/>
                 <w:lang w:val="en-US"/>
               </w:rPr>
               <w:t>ADMIN_MENU, ADMIN_STATUS, ADMIN_CAMERA_SETTINGS, ADMIN_DELETE_DONE, ADMIN_USB_READY, ADMIN_USB_REMOVE, ADMIN_USB_EXPORT_DONE</w:t>
@@ -4044,6 +3901,7 @@
             <w:r>
               <w:rPr>
                 <w:sz w:val="19"/>
+                <w:szCs w:val="19"/>
                 <w:lang w:val="en-US"/>
               </w:rPr>
               <w:t>ADMIN_RESTART_PENDING, ADMIN_USB_CHECK, ADMIN_USB_EJECT</w:t>
@@ -4111,6 +3969,7 @@
             <w:r>
               <w:rPr>
                 <w:sz w:val="19"/>
+                <w:szCs w:val="19"/>
                 <w:lang w:val="en-US"/>
               </w:rPr>
               <w:t>ADMIN_DELETE_CONFIRM, ADMIN_DELETE_RUNNING</w:t>
@@ -4240,6 +4099,7 @@
             <w:r>
               <w:rPr>
                 <w:sz w:val="19"/>
+                <w:szCs w:val="19"/>
                 <w:lang w:val="en-US"/>
               </w:rPr>
               <w:t>ADMIN_USB_PROBLEM, ADMIN_USB_CONFLICTS</w:t>
@@ -4307,6 +4167,7 @@
             <w:r>
               <w:rPr>
                 <w:sz w:val="19"/>
+                <w:szCs w:val="19"/>
                 <w:lang w:val="en-US"/>
               </w:rPr>
               <w:t>ADMIN_USB_COPY, ADMIN_USB_RESOLVE</w:t>
@@ -4462,31 +4323,35 @@
       </w:pPr>
       <w:r>
         <w:rPr>
-          <w:rFonts w:ascii="Consolas" w:hAnsi="Consolas"/>
-          <w:sz w:val="19"/>
+          <w:rFonts w:ascii="Consolas" w:eastAsia="Consolas" w:hAnsi="Consolas" w:cs="Consolas"/>
+          <w:sz w:val="19"/>
+          <w:szCs w:val="19"/>
         </w:rPr>
         <w:t>sudo apt update</w:t>
       </w:r>
       <w:r>
         <w:rPr>
-          <w:rFonts w:ascii="Consolas" w:hAnsi="Consolas"/>
-          <w:sz w:val="19"/>
+          <w:rFonts w:ascii="Consolas" w:eastAsia="Consolas" w:hAnsi="Consolas" w:cs="Consolas"/>
+          <w:sz w:val="19"/>
+          <w:szCs w:val="19"/>
         </w:rPr>
         <w:br/>
         <w:t>sudo apt upgrade -y</w:t>
       </w:r>
       <w:r>
         <w:rPr>
-          <w:rFonts w:ascii="Consolas" w:hAnsi="Consolas"/>
-          <w:sz w:val="19"/>
+          <w:rFonts w:ascii="Consolas" w:eastAsia="Consolas" w:hAnsi="Consolas" w:cs="Consolas"/>
+          <w:sz w:val="19"/>
+          <w:szCs w:val="19"/>
         </w:rPr>
         <w:br/>
         <w:t>sudo apt install python3-pygame python3-qrcode python3-pil \</w:t>
       </w:r>
       <w:r>
         <w:rPr>
-          <w:rFonts w:ascii="Consolas" w:hAnsi="Consolas"/>
-          <w:sz w:val="19"/>
+          <w:rFonts w:ascii="Consolas" w:eastAsia="Consolas" w:hAnsi="Consolas" w:cs="Consolas"/>
+          <w:sz w:val="19"/>
+          <w:szCs w:val="19"/>
         </w:rPr>
         <w:br/>
         <w:t xml:space="preserve">    python3-gphoto2 libgphoto2-6 ufw -y</w:t>
@@ -4518,7 +4383,7 @@
           <w:noProof/>
         </w:rPr>
         <w:drawing>
-          <wp:inline distT="0" distB="0" distL="0" distR="0" wp14:anchorId="31D55B27" wp14:editId="3AB1FB11">
+          <wp:inline distT="0" distB="0" distL="0" distR="0" wp14:anchorId="3B673B58" wp14:editId="4FBAB676">
             <wp:extent cx="4381500" cy="3276600"/>
             <wp:effectExtent l="0" t="0" r="0" b="0"/>
             <wp:docPr id="1" name="Grafik 1" descr="Ein Bild, das Text, Screenshot, Software, Display enthält.&#10;&#10;KI-generierte Inhalte können fehlerhaft sein."/>
@@ -4603,8 +4468,9 @@
       </w:pPr>
       <w:r>
         <w:rPr>
-          <w:rFonts w:ascii="Consolas" w:hAnsi="Consolas"/>
-          <w:sz w:val="19"/>
+          <w:rFonts w:ascii="Consolas" w:eastAsia="Consolas" w:hAnsi="Consolas" w:cs="Consolas"/>
+          <w:sz w:val="19"/>
+          <w:szCs w:val="19"/>
         </w:rPr>
         <w:t>sudo raspi-config</w:t>
       </w:r>
@@ -4617,14 +4483,8 @@
           <w:numId w:val="1"/>
         </w:numPr>
         <w:spacing w:after="90"/>
-        <w:rPr>
-          <w:lang w:val="en-US"/>
-        </w:rPr>
-      </w:pPr>
-      <w:r>
-        <w:rPr>
-          <w:lang w:val="en-US"/>
-        </w:rPr>
+      </w:pPr>
+      <w:r>
         <w:t>Display Options → Screen Blanking → No</w:t>
       </w:r>
     </w:p>
@@ -4639,7 +4499,7 @@
         </w:rPr>
         <w:lastRenderedPageBreak/>
         <w:drawing>
-          <wp:inline distT="0" distB="0" distL="0" distR="0" wp14:anchorId="3E901713" wp14:editId="58F98A99">
+          <wp:inline distT="0" distB="0" distL="0" distR="0" wp14:anchorId="30908F00" wp14:editId="48F6ABCD">
             <wp:extent cx="4381500" cy="3038475"/>
             <wp:effectExtent l="0" t="0" r="0" b="0"/>
             <wp:docPr id="1523891900" name="Grafik 1523891900" descr="Ein Bild, das Text, Screenshot, Software, Multimedia-Software enthält.&#10;&#10;KI-generierte Inhalte können fehlerhaft sein."/>
@@ -4707,13 +4567,7 @@
         <w:spacing w:after="160"/>
       </w:pPr>
       <w:r>
-        <w:t xml:space="preserve">In </w:t>
-      </w:r>
-      <w:r>
-        <w:t>/boot/firmware/config.txt</w:t>
-      </w:r>
-      <w:r>
-        <w:t>:</w:t>
+        <w:t>In /boot/firmware/config.txt:</w:t>
       </w:r>
     </w:p>
     <w:p>
@@ -4723,15 +4577,17 @@
       </w:pPr>
       <w:r>
         <w:rPr>
-          <w:rFonts w:ascii="Consolas" w:hAnsi="Consolas"/>
-          <w:sz w:val="19"/>
+          <w:rFonts w:ascii="Consolas" w:eastAsia="Consolas" w:hAnsi="Consolas" w:cs="Consolas"/>
+          <w:sz w:val="19"/>
+          <w:szCs w:val="19"/>
         </w:rPr>
         <w:t># Bluetooth komplett deaktivieren</w:t>
       </w:r>
       <w:r>
         <w:rPr>
-          <w:rFonts w:ascii="Consolas" w:hAnsi="Consolas"/>
-          <w:sz w:val="19"/>
+          <w:rFonts w:ascii="Consolas" w:eastAsia="Consolas" w:hAnsi="Consolas" w:cs="Consolas"/>
+          <w:sz w:val="19"/>
+          <w:szCs w:val="19"/>
         </w:rPr>
         <w:br/>
         <w:t>dtoverlay=disable-bt</w:t>
@@ -4782,8 +4638,9 @@
       </w:pPr>
       <w:r>
         <w:rPr>
-          <w:rFonts w:ascii="Consolas" w:hAnsi="Consolas"/>
-          <w:sz w:val="19"/>
+          <w:rFonts w:ascii="Consolas" w:eastAsia="Consolas" w:hAnsi="Consolas" w:cs="Consolas"/>
+          <w:sz w:val="19"/>
+          <w:szCs w:val="19"/>
         </w:rPr>
         <w:t>sudo raspi-config</w:t>
       </w:r>
@@ -4796,14 +4653,8 @@
           <w:numId w:val="1"/>
         </w:numPr>
         <w:spacing w:after="90"/>
-        <w:rPr>
-          <w:lang w:val="en-US"/>
-        </w:rPr>
-      </w:pPr>
-      <w:r>
-        <w:rPr>
-          <w:lang w:val="en-US"/>
-        </w:rPr>
+      </w:pPr>
+      <w:r>
         <w:t>3 Interface Options → I3 VNC → Enable</w:t>
       </w:r>
     </w:p>
@@ -4833,8 +4684,9 @@
       </w:pPr>
       <w:r>
         <w:rPr>
-          <w:rFonts w:ascii="Consolas" w:hAnsi="Consolas"/>
-          <w:sz w:val="19"/>
+          <w:rFonts w:ascii="Consolas" w:eastAsia="Consolas" w:hAnsi="Consolas" w:cs="Consolas"/>
+          <w:sz w:val="19"/>
+          <w:szCs w:val="19"/>
         </w:rPr>
         <w:t>sudo reboot</w:t>
       </w:r>
@@ -4865,16 +4717,18 @@
       </w:pPr>
       <w:r>
         <w:rPr>
-          <w:rFonts w:ascii="Consolas" w:hAnsi="Consolas"/>
-          <w:sz w:val="19"/>
+          <w:rFonts w:ascii="Consolas" w:eastAsia="Consolas" w:hAnsi="Consolas" w:cs="Consolas"/>
+          <w:sz w:val="19"/>
+          <w:szCs w:val="19"/>
           <w:lang w:val="en-US"/>
         </w:rPr>
         <w:t>sudo systemctl stop wayvnc</w:t>
       </w:r>
       <w:r>
         <w:rPr>
-          <w:rFonts w:ascii="Consolas" w:hAnsi="Consolas"/>
-          <w:sz w:val="19"/>
+          <w:rFonts w:ascii="Consolas" w:eastAsia="Consolas" w:hAnsi="Consolas" w:cs="Consolas"/>
+          <w:sz w:val="19"/>
+          <w:szCs w:val="19"/>
           <w:lang w:val="en-US"/>
         </w:rPr>
         <w:br/>
@@ -4905,16 +4759,18 @@
       </w:pPr>
       <w:r>
         <w:rPr>
-          <w:rFonts w:ascii="Consolas" w:hAnsi="Consolas"/>
-          <w:sz w:val="19"/>
+          <w:rFonts w:ascii="Consolas" w:eastAsia="Consolas" w:hAnsi="Consolas" w:cs="Consolas"/>
+          <w:sz w:val="19"/>
+          <w:szCs w:val="19"/>
           <w:lang w:val="en-US"/>
         </w:rPr>
         <w:t># Fix für grauen VNC-Bildschirm bei Headless-Boot</w:t>
       </w:r>
       <w:r>
         <w:rPr>
-          <w:rFonts w:ascii="Consolas" w:hAnsi="Consolas"/>
-          <w:sz w:val="19"/>
+          <w:rFonts w:ascii="Consolas" w:eastAsia="Consolas" w:hAnsi="Consolas" w:cs="Consolas"/>
+          <w:sz w:val="19"/>
+          <w:szCs w:val="19"/>
           <w:lang w:val="en-US"/>
         </w:rPr>
         <w:br/>
@@ -4922,8 +4778,9 @@
       </w:r>
       <w:r>
         <w:rPr>
-          <w:rFonts w:ascii="Consolas" w:hAnsi="Consolas"/>
-          <w:sz w:val="19"/>
+          <w:rFonts w:ascii="Consolas" w:eastAsia="Consolas" w:hAnsi="Consolas" w:cs="Consolas"/>
+          <w:sz w:val="19"/>
+          <w:szCs w:val="19"/>
           <w:lang w:val="en-US"/>
         </w:rPr>
         <w:br/>
@@ -4931,8 +4788,9 @@
       </w:r>
       <w:r>
         <w:rPr>
-          <w:rFonts w:ascii="Consolas" w:hAnsi="Consolas"/>
-          <w:sz w:val="19"/>
+          <w:rFonts w:ascii="Consolas" w:eastAsia="Consolas" w:hAnsi="Consolas" w:cs="Consolas"/>
+          <w:sz w:val="19"/>
+          <w:szCs w:val="19"/>
           <w:lang w:val="en-US"/>
         </w:rPr>
         <w:br/>
@@ -4946,8 +4804,9 @@
       </w:pPr>
       <w:r>
         <w:rPr>
-          <w:rFonts w:ascii="Consolas" w:hAnsi="Consolas"/>
-          <w:sz w:val="19"/>
+          <w:rFonts w:ascii="Consolas" w:eastAsia="Consolas" w:hAnsi="Consolas" w:cs="Consolas"/>
+          <w:sz w:val="19"/>
+          <w:szCs w:val="19"/>
         </w:rPr>
         <w:t>sudo reboot</w:t>
       </w:r>
@@ -5646,6 +5505,7 @@
             <w:r>
               <w:rPr>
                 <w:sz w:val="19"/>
+                <w:szCs w:val="19"/>
                 <w:lang w:val="en-US"/>
               </w:rPr>
               <w:t>Shutter-Trigger (Ausgang, active LOW)</w:t>
@@ -5897,6 +5757,7 @@
             <w:r>
               <w:rPr>
                 <w:sz w:val="19"/>
+                <w:szCs w:val="19"/>
                 <w:lang w:val="en-US"/>
               </w:rPr>
               <w:t>LED-Ring DI (SPI0 MOSI, neopixel_spi)</w:t>
@@ -6017,7 +5878,7 @@
           <w:noProof/>
         </w:rPr>
         <w:drawing>
-          <wp:inline distT="0" distB="0" distL="0" distR="0" wp14:anchorId="6D43853F" wp14:editId="7846FE19">
+          <wp:inline distT="0" distB="0" distL="0" distR="0" wp14:anchorId="63AE1671" wp14:editId="3A29B6A2">
             <wp:extent cx="4762500" cy="2733675"/>
             <wp:effectExtent l="0" t="0" r="0" b="0"/>
             <wp:docPr id="1585162868" name="Grafik 1585162868" descr="Ein Bild, das Text, Zahl enthält.&#10;&#10;KI-generierte Inhalte können fehlerhaft sein."/>
@@ -6140,30 +6001,34 @@
       </w:pPr>
       <w:r>
         <w:rPr>
-          <w:rFonts w:ascii="Consolas" w:hAnsi="Consolas"/>
-          <w:sz w:val="19"/>
+          <w:rFonts w:ascii="Consolas" w:eastAsia="Consolas" w:hAnsi="Consolas" w:cs="Consolas"/>
+          <w:sz w:val="19"/>
+          <w:szCs w:val="19"/>
         </w:rPr>
         <w:t>GPIO 15 (Pin 10) --[interner Pull-up]--&gt; Taster-Pin 1</w:t>
       </w:r>
       <w:r>
         <w:rPr>
-          <w:rFonts w:ascii="Consolas" w:hAnsi="Consolas"/>
-          <w:sz w:val="19"/>
+          <w:rFonts w:ascii="Consolas" w:eastAsia="Consolas" w:hAnsi="Consolas" w:cs="Consolas"/>
+          <w:sz w:val="19"/>
+          <w:szCs w:val="19"/>
         </w:rPr>
         <w:br/>
         <w:t>GND (Pin 14)     ------------------------&gt; Taster-Pin 2</w:t>
       </w:r>
       <w:r>
         <w:rPr>
-          <w:rFonts w:ascii="Consolas" w:hAnsi="Consolas"/>
-          <w:sz w:val="19"/>
-        </w:rPr>
-        <w:br/>
-      </w:r>
-      <w:r>
-        <w:rPr>
-          <w:rFonts w:ascii="Consolas" w:hAnsi="Consolas"/>
-          <w:sz w:val="19"/>
+          <w:rFonts w:ascii="Consolas" w:eastAsia="Consolas" w:hAnsi="Consolas" w:cs="Consolas"/>
+          <w:sz w:val="19"/>
+          <w:szCs w:val="19"/>
+        </w:rPr>
+        <w:br/>
+      </w:r>
+      <w:r>
+        <w:rPr>
+          <w:rFonts w:ascii="Consolas" w:eastAsia="Consolas" w:hAnsi="Consolas" w:cs="Consolas"/>
+          <w:sz w:val="19"/>
+          <w:szCs w:val="19"/>
         </w:rPr>
         <w:br/>
         <w:t>-&gt; Druck zieht GPIO 15 auf LOW</w:t>
@@ -6192,203 +6057,212 @@
       </w:pPr>
       <w:r>
         <w:rPr>
-          <w:rFonts w:ascii="Consolas" w:hAnsi="Consolas"/>
-          <w:sz w:val="19"/>
-        </w:rPr>
-        <w:t xml:space="preserve">TO-92 </w:t>
-      </w:r>
-      <w:r>
-        <w:rPr>
-          <w:rFonts w:ascii="Consolas" w:eastAsia="Consolas" w:hAnsi="Consolas" w:cs="Consolas"/>
-          <w:sz w:val="19"/>
-          <w:szCs w:val="19"/>
-        </w:rPr>
-        <w:t>Gehaeuse</w:t>
-      </w:r>
-      <w:r>
-        <w:rPr>
-          <w:rFonts w:ascii="Consolas" w:hAnsi="Consolas"/>
-          <w:sz w:val="19"/>
-        </w:rPr>
-        <w:t xml:space="preserve"> (flache Seite vorn)</w:t>
-      </w:r>
-      <w:r>
-        <w:rPr>
-          <w:rFonts w:ascii="Consolas" w:hAnsi="Consolas"/>
-          <w:sz w:val="19"/>
+          <w:rFonts w:ascii="Consolas" w:eastAsia="Consolas" w:hAnsi="Consolas" w:cs="Consolas"/>
+          <w:sz w:val="19"/>
+          <w:szCs w:val="19"/>
+        </w:rPr>
+        <w:t>TO-92 Gehaeuse (flache Seite vorn)</w:t>
+      </w:r>
+      <w:r>
+        <w:rPr>
+          <w:rFonts w:ascii="Consolas" w:eastAsia="Consolas" w:hAnsi="Consolas" w:cs="Consolas"/>
+          <w:sz w:val="19"/>
+          <w:szCs w:val="19"/>
         </w:rPr>
         <w:br/>
         <w:t xml:space="preserve">   .------.</w:t>
       </w:r>
       <w:r>
         <w:rPr>
-          <w:rFonts w:ascii="Consolas" w:hAnsi="Consolas"/>
-          <w:sz w:val="19"/>
+          <w:rFonts w:ascii="Consolas" w:eastAsia="Consolas" w:hAnsi="Consolas" w:cs="Consolas"/>
+          <w:sz w:val="19"/>
+          <w:szCs w:val="19"/>
         </w:rPr>
         <w:br/>
         <w:t xml:space="preserve">  /        \</w:t>
       </w:r>
       <w:r>
         <w:rPr>
-          <w:rFonts w:ascii="Consolas" w:hAnsi="Consolas"/>
-          <w:sz w:val="19"/>
+          <w:rFonts w:ascii="Consolas" w:eastAsia="Consolas" w:hAnsi="Consolas" w:cs="Consolas"/>
+          <w:sz w:val="19"/>
+          <w:szCs w:val="19"/>
         </w:rPr>
         <w:br/>
         <w:t xml:space="preserve"> |  BC547   |</w:t>
       </w:r>
       <w:r>
         <w:rPr>
-          <w:rFonts w:ascii="Consolas" w:hAnsi="Consolas"/>
-          <w:sz w:val="19"/>
+          <w:rFonts w:ascii="Consolas" w:eastAsia="Consolas" w:hAnsi="Consolas" w:cs="Consolas"/>
+          <w:sz w:val="19"/>
+          <w:szCs w:val="19"/>
         </w:rPr>
         <w:br/>
         <w:t xml:space="preserve"> |__________|</w:t>
       </w:r>
       <w:r>
         <w:rPr>
-          <w:rFonts w:ascii="Consolas" w:hAnsi="Consolas"/>
-          <w:sz w:val="19"/>
+          <w:rFonts w:ascii="Consolas" w:eastAsia="Consolas" w:hAnsi="Consolas" w:cs="Consolas"/>
+          <w:sz w:val="19"/>
+          <w:szCs w:val="19"/>
         </w:rPr>
         <w:br/>
         <w:t xml:space="preserve">    |  |  |</w:t>
       </w:r>
       <w:r>
         <w:rPr>
-          <w:rFonts w:ascii="Consolas" w:hAnsi="Consolas"/>
-          <w:sz w:val="19"/>
+          <w:rFonts w:ascii="Consolas" w:eastAsia="Consolas" w:hAnsi="Consolas" w:cs="Consolas"/>
+          <w:sz w:val="19"/>
+          <w:szCs w:val="19"/>
         </w:rPr>
         <w:br/>
         <w:t xml:space="preserve">    C  B  E</w:t>
       </w:r>
       <w:r>
         <w:rPr>
-          <w:rFonts w:ascii="Consolas" w:hAnsi="Consolas"/>
-          <w:sz w:val="19"/>
+          <w:rFonts w:ascii="Consolas" w:eastAsia="Consolas" w:hAnsi="Consolas" w:cs="Consolas"/>
+          <w:sz w:val="19"/>
+          <w:szCs w:val="19"/>
         </w:rPr>
         <w:br/>
         <w:t xml:space="preserve">    |  |  |</w:t>
       </w:r>
       <w:r>
         <w:rPr>
-          <w:rFonts w:ascii="Consolas" w:hAnsi="Consolas"/>
-          <w:sz w:val="19"/>
+          <w:rFonts w:ascii="Consolas" w:eastAsia="Consolas" w:hAnsi="Consolas" w:cs="Consolas"/>
+          <w:sz w:val="19"/>
+          <w:szCs w:val="19"/>
         </w:rPr>
         <w:br/>
         <w:t xml:space="preserve">    |  |  +---&gt; Emitter (E) --&gt; GND (Pin 34)</w:t>
       </w:r>
       <w:r>
         <w:rPr>
-          <w:rFonts w:ascii="Consolas" w:hAnsi="Consolas"/>
-          <w:sz w:val="19"/>
+          <w:rFonts w:ascii="Consolas" w:eastAsia="Consolas" w:hAnsi="Consolas" w:cs="Consolas"/>
+          <w:sz w:val="19"/>
+          <w:szCs w:val="19"/>
         </w:rPr>
         <w:br/>
         <w:t xml:space="preserve">    |  +------&gt; Basis (B) --&gt; [1 kOhm] --&gt; GPIO 16 (Pin 36)</w:t>
       </w:r>
       <w:r>
         <w:rPr>
-          <w:rFonts w:ascii="Consolas" w:hAnsi="Consolas"/>
-          <w:sz w:val="19"/>
+          <w:rFonts w:ascii="Consolas" w:eastAsia="Consolas" w:hAnsi="Consolas" w:cs="Consolas"/>
+          <w:sz w:val="19"/>
+          <w:szCs w:val="19"/>
         </w:rPr>
         <w:br/>
         <w:t xml:space="preserve">    +---------&gt; Kollektor (C) --&gt; Taster-LED Minuspol (-)</w:t>
       </w:r>
       <w:r>
         <w:rPr>
-          <w:rFonts w:ascii="Consolas" w:hAnsi="Consolas"/>
-          <w:sz w:val="19"/>
-        </w:rPr>
-        <w:br/>
-      </w:r>
-      <w:r>
-        <w:rPr>
-          <w:rFonts w:ascii="Consolas" w:hAnsi="Consolas"/>
-          <w:sz w:val="19"/>
+          <w:rFonts w:ascii="Consolas" w:eastAsia="Consolas" w:hAnsi="Consolas" w:cs="Consolas"/>
+          <w:sz w:val="19"/>
+          <w:szCs w:val="19"/>
+        </w:rPr>
+        <w:br/>
+      </w:r>
+      <w:r>
+        <w:rPr>
+          <w:rFonts w:ascii="Consolas" w:eastAsia="Consolas" w:hAnsi="Consolas" w:cs="Consolas"/>
+          <w:sz w:val="19"/>
+          <w:szCs w:val="19"/>
         </w:rPr>
         <w:br/>
         <w:t>Schaltplan-Logik:</w:t>
       </w:r>
       <w:r>
         <w:rPr>
-          <w:rFonts w:ascii="Consolas" w:hAnsi="Consolas"/>
-          <w:sz w:val="19"/>
-        </w:rPr>
-        <w:br/>
-      </w:r>
-      <w:r>
-        <w:rPr>
-          <w:rFonts w:ascii="Consolas" w:hAnsi="Consolas"/>
-          <w:sz w:val="19"/>
+          <w:rFonts w:ascii="Consolas" w:eastAsia="Consolas" w:hAnsi="Consolas" w:cs="Consolas"/>
+          <w:sz w:val="19"/>
+          <w:szCs w:val="19"/>
+        </w:rPr>
+        <w:br/>
+      </w:r>
+      <w:r>
+        <w:rPr>
+          <w:rFonts w:ascii="Consolas" w:eastAsia="Consolas" w:hAnsi="Consolas" w:cs="Consolas"/>
+          <w:sz w:val="19"/>
+          <w:szCs w:val="19"/>
         </w:rPr>
         <w:br/>
         <w:t>[Raspi 5V, Pin 4] ---------&gt; (+) [Taster-LED] (-)</w:t>
       </w:r>
       <w:r>
         <w:rPr>
-          <w:rFonts w:ascii="Consolas" w:hAnsi="Consolas"/>
-          <w:sz w:val="19"/>
+          <w:rFonts w:ascii="Consolas" w:eastAsia="Consolas" w:hAnsi="Consolas" w:cs="Consolas"/>
+          <w:sz w:val="19"/>
+          <w:szCs w:val="19"/>
         </w:rPr>
         <w:br/>
         <w:t xml:space="preserve">                                        |</w:t>
       </w:r>
       <w:r>
         <w:rPr>
-          <w:rFonts w:ascii="Consolas" w:hAnsi="Consolas"/>
-          <w:sz w:val="19"/>
+          <w:rFonts w:ascii="Consolas" w:eastAsia="Consolas" w:hAnsi="Consolas" w:cs="Consolas"/>
+          <w:sz w:val="19"/>
+          <w:szCs w:val="19"/>
         </w:rPr>
         <w:br/>
         <w:t xml:space="preserve">                                        v</w:t>
       </w:r>
       <w:r>
         <w:rPr>
-          <w:rFonts w:ascii="Consolas" w:hAnsi="Consolas"/>
-          <w:sz w:val="19"/>
+          <w:rFonts w:ascii="Consolas" w:eastAsia="Consolas" w:hAnsi="Consolas" w:cs="Consolas"/>
+          <w:sz w:val="19"/>
+          <w:szCs w:val="19"/>
         </w:rPr>
         <w:br/>
         <w:t xml:space="preserve">                                  (Kollektor C)</w:t>
       </w:r>
       <w:r>
         <w:rPr>
-          <w:rFonts w:ascii="Consolas" w:hAnsi="Consolas"/>
-          <w:sz w:val="19"/>
-        </w:rPr>
-        <w:br/>
-      </w:r>
-      <w:r>
-        <w:rPr>
-          <w:rFonts w:ascii="Consolas" w:hAnsi="Consolas"/>
-          <w:sz w:val="19"/>
+          <w:rFonts w:ascii="Consolas" w:eastAsia="Consolas" w:hAnsi="Consolas" w:cs="Consolas"/>
+          <w:sz w:val="19"/>
+          <w:szCs w:val="19"/>
+        </w:rPr>
+        <w:br/>
+      </w:r>
+      <w:r>
+        <w:rPr>
+          <w:rFonts w:ascii="Consolas" w:eastAsia="Consolas" w:hAnsi="Consolas" w:cs="Consolas"/>
+          <w:sz w:val="19"/>
+          <w:szCs w:val="19"/>
         </w:rPr>
         <w:br/>
         <w:t>[Raspi GPIO 16, Pin 36] ---&gt; [1 kOhm] ---&gt; (Basis B) [NPN-Transistor]</w:t>
       </w:r>
       <w:r>
         <w:rPr>
-          <w:rFonts w:ascii="Consolas" w:hAnsi="Consolas"/>
-          <w:sz w:val="19"/>
+          <w:rFonts w:ascii="Consolas" w:eastAsia="Consolas" w:hAnsi="Consolas" w:cs="Consolas"/>
+          <w:sz w:val="19"/>
+          <w:szCs w:val="19"/>
         </w:rPr>
         <w:br/>
         <w:t xml:space="preserve">                                                (Emitter E)</w:t>
       </w:r>
       <w:r>
         <w:rPr>
-          <w:rFonts w:ascii="Consolas" w:hAnsi="Consolas"/>
-          <w:sz w:val="19"/>
+          <w:rFonts w:ascii="Consolas" w:eastAsia="Consolas" w:hAnsi="Consolas" w:cs="Consolas"/>
+          <w:sz w:val="19"/>
+          <w:szCs w:val="19"/>
         </w:rPr>
         <w:br/>
         <w:t xml:space="preserve">                                                     |</w:t>
       </w:r>
       <w:r>
         <w:rPr>
-          <w:rFonts w:ascii="Consolas" w:hAnsi="Consolas"/>
-          <w:sz w:val="19"/>
+          <w:rFonts w:ascii="Consolas" w:eastAsia="Consolas" w:hAnsi="Consolas" w:cs="Consolas"/>
+          <w:sz w:val="19"/>
+          <w:szCs w:val="19"/>
         </w:rPr>
         <w:br/>
         <w:t xml:space="preserve">                                                     v</w:t>
       </w:r>
       <w:r>
         <w:rPr>
-          <w:rFonts w:ascii="Consolas" w:hAnsi="Consolas"/>
-          <w:sz w:val="19"/>
+          <w:rFonts w:ascii="Consolas" w:eastAsia="Consolas" w:hAnsi="Consolas" w:cs="Consolas"/>
+          <w:sz w:val="19"/>
+          <w:szCs w:val="19"/>
         </w:rPr>
         <w:br/>
         <w:t xml:space="preserve">                                          [Raspi GND, Pin 34]</w:t>
@@ -6417,176 +6291,131 @@
       </w:pPr>
       <w:r>
         <w:rPr>
-          <w:rFonts w:ascii="Consolas" w:hAnsi="Consolas"/>
-          <w:sz w:val="19"/>
+          <w:rFonts w:ascii="Consolas" w:eastAsia="Consolas" w:hAnsi="Consolas" w:cs="Consolas"/>
+          <w:sz w:val="19"/>
+          <w:szCs w:val="19"/>
         </w:rPr>
         <w:t>Raspberry Pi        OPTOKOPPLER (PC817)         Nikon D3300</w:t>
       </w:r>
       <w:r>
         <w:rPr>
-          <w:rFonts w:ascii="Consolas" w:hAnsi="Consolas"/>
-          <w:sz w:val="19"/>
+          <w:rFonts w:ascii="Consolas" w:eastAsia="Consolas" w:hAnsi="Consolas" w:cs="Consolas"/>
+          <w:sz w:val="19"/>
+          <w:szCs w:val="19"/>
         </w:rPr>
         <w:br/>
         <w:t xml:space="preserve">                        +--------+</w:t>
       </w:r>
       <w:r>
         <w:rPr>
-          <w:rFonts w:ascii="Consolas" w:hAnsi="Consolas"/>
-          <w:sz w:val="19"/>
-        </w:rPr>
-        <w:br/>
-        <w:t xml:space="preserve">Pin 11 (GPIO17) -&gt; 220 Ohm -&gt; | 1    4 | </w:t>
-      </w:r>
-      <w:r>
-        <w:rPr>
-          <w:rFonts w:ascii="Consolas" w:eastAsia="Consolas" w:hAnsi="Consolas" w:cs="Consolas"/>
-          <w:sz w:val="19"/>
-          <w:szCs w:val="19"/>
-        </w:rPr>
-        <w:t>===&gt;</w:t>
-      </w:r>
-      <w:r>
-        <w:rPr>
-          <w:rFonts w:ascii="Consolas" w:hAnsi="Consolas"/>
-          <w:sz w:val="19"/>
-        </w:rPr>
-        <w:t xml:space="preserve"> Pin 5 (FOCUS) + Pin 6 (SHUTTER)</w:t>
-      </w:r>
-      <w:r>
-        <w:rPr>
-          <w:rFonts w:ascii="Consolas" w:hAnsi="Consolas"/>
-          <w:sz w:val="19"/>
-        </w:rPr>
-        <w:br/>
-        <w:t xml:space="preserve">                       </w:t>
-      </w:r>
-      <w:r>
-        <w:rPr>
-          <w:rFonts w:ascii="Consolas" w:eastAsia="Consolas" w:hAnsi="Consolas" w:cs="Consolas"/>
-          <w:sz w:val="19"/>
-          <w:szCs w:val="19"/>
-        </w:rPr>
-        <w:t>|        |</w:t>
-      </w:r>
-      <w:r>
-        <w:rPr>
-          <w:rFonts w:ascii="Consolas" w:hAnsi="Consolas"/>
-          <w:sz w:val="19"/>
-        </w:rPr>
-        <w:t xml:space="preserve">        (beide </w:t>
-      </w:r>
-      <w:r>
-        <w:rPr>
-          <w:rFonts w:ascii="Consolas" w:eastAsia="Consolas" w:hAnsi="Consolas" w:cs="Consolas"/>
-          <w:sz w:val="19"/>
-          <w:szCs w:val="19"/>
-        </w:rPr>
-        <w:t>zusammengeloetet</w:t>
-      </w:r>
-      <w:r>
-        <w:rPr>
-          <w:rFonts w:ascii="Consolas" w:hAnsi="Consolas"/>
-          <w:sz w:val="19"/>
-        </w:rPr>
-        <w:t>!)</w:t>
-      </w:r>
-      <w:r>
-        <w:rPr>
-          <w:rFonts w:ascii="Consolas" w:hAnsi="Consolas"/>
-          <w:sz w:val="19"/>
-        </w:rPr>
-        <w:br/>
-        <w:t xml:space="preserve">Pin 9 (GND) -----------------&gt; | 2    3 | </w:t>
-      </w:r>
-      <w:r>
-        <w:rPr>
-          <w:rFonts w:ascii="Consolas" w:eastAsia="Consolas" w:hAnsi="Consolas" w:cs="Consolas"/>
-          <w:sz w:val="19"/>
-          <w:szCs w:val="19"/>
-        </w:rPr>
-        <w:t>===&gt;</w:t>
-      </w:r>
-      <w:r>
-        <w:rPr>
-          <w:rFonts w:ascii="Consolas" w:hAnsi="Consolas"/>
-          <w:sz w:val="19"/>
-        </w:rPr>
-        <w:t xml:space="preserve"> Pin 3 (GND)</w:t>
-      </w:r>
-      <w:r>
-        <w:rPr>
-          <w:rFonts w:ascii="Consolas" w:hAnsi="Consolas"/>
-          <w:sz w:val="19"/>
+          <w:rFonts w:ascii="Consolas" w:eastAsia="Consolas" w:hAnsi="Consolas" w:cs="Consolas"/>
+          <w:sz w:val="19"/>
+          <w:szCs w:val="19"/>
+        </w:rPr>
+        <w:br/>
+        <w:t>Pin 11 (GPIO17) -&gt; 220 Ohm -&gt; | 1    4 | ===&gt; Pin 5 (FOCUS) + Pin 6 (SHUTTER)</w:t>
+      </w:r>
+      <w:r>
+        <w:rPr>
+          <w:rFonts w:ascii="Consolas" w:eastAsia="Consolas" w:hAnsi="Consolas" w:cs="Consolas"/>
+          <w:sz w:val="19"/>
+          <w:szCs w:val="19"/>
+        </w:rPr>
+        <w:br/>
+        <w:t xml:space="preserve">                       |        |        (beide zusammengeloetet!)</w:t>
+      </w:r>
+      <w:r>
+        <w:rPr>
+          <w:rFonts w:ascii="Consolas" w:eastAsia="Consolas" w:hAnsi="Consolas" w:cs="Consolas"/>
+          <w:sz w:val="19"/>
+          <w:szCs w:val="19"/>
+        </w:rPr>
+        <w:br/>
+        <w:t>Pin 9 (GND) -----------------&gt; | 2    3 | ===&gt; Pin 3 (GND)</w:t>
+      </w:r>
+      <w:r>
+        <w:rPr>
+          <w:rFonts w:ascii="Consolas" w:eastAsia="Consolas" w:hAnsi="Consolas" w:cs="Consolas"/>
+          <w:sz w:val="19"/>
+          <w:szCs w:val="19"/>
         </w:rPr>
         <w:br/>
         <w:t xml:space="preserve">                        +--------+</w:t>
       </w:r>
       <w:r>
         <w:rPr>
-          <w:rFonts w:ascii="Consolas" w:hAnsi="Consolas"/>
-          <w:sz w:val="19"/>
-        </w:rPr>
-        <w:br/>
-      </w:r>
-      <w:r>
-        <w:rPr>
-          <w:rFonts w:ascii="Consolas" w:hAnsi="Consolas"/>
-          <w:sz w:val="19"/>
+          <w:rFonts w:ascii="Consolas" w:eastAsia="Consolas" w:hAnsi="Consolas" w:cs="Consolas"/>
+          <w:sz w:val="19"/>
+          <w:szCs w:val="19"/>
+        </w:rPr>
+        <w:br/>
+      </w:r>
+      <w:r>
+        <w:rPr>
+          <w:rFonts w:ascii="Consolas" w:eastAsia="Consolas" w:hAnsi="Consolas" w:cs="Consolas"/>
+          <w:sz w:val="19"/>
+          <w:szCs w:val="19"/>
         </w:rPr>
         <w:br/>
         <w:t>Eingang Optokoppler:</w:t>
       </w:r>
       <w:r>
         <w:rPr>
-          <w:rFonts w:ascii="Consolas" w:hAnsi="Consolas"/>
-          <w:sz w:val="19"/>
+          <w:rFonts w:ascii="Consolas" w:eastAsia="Consolas" w:hAnsi="Consolas" w:cs="Consolas"/>
+          <w:sz w:val="19"/>
+          <w:szCs w:val="19"/>
         </w:rPr>
         <w:br/>
         <w:t xml:space="preserve">  Pi Pin 11 (GPIO17) -&gt; 220 Ohm -&gt; Optokoppler Pin 1</w:t>
       </w:r>
       <w:r>
         <w:rPr>
-          <w:rFonts w:ascii="Consolas" w:hAnsi="Consolas"/>
-          <w:sz w:val="19"/>
+          <w:rFonts w:ascii="Consolas" w:eastAsia="Consolas" w:hAnsi="Consolas" w:cs="Consolas"/>
+          <w:sz w:val="19"/>
+          <w:szCs w:val="19"/>
         </w:rPr>
         <w:br/>
         <w:t xml:space="preserve">  Pi Pin 9 (GND)     -&gt; Optokoppler Pin 2</w:t>
       </w:r>
       <w:r>
         <w:rPr>
-          <w:rFonts w:ascii="Consolas" w:hAnsi="Consolas"/>
-          <w:sz w:val="19"/>
-        </w:rPr>
-        <w:br/>
-      </w:r>
-      <w:r>
-        <w:rPr>
-          <w:rFonts w:ascii="Consolas" w:hAnsi="Consolas"/>
-          <w:sz w:val="19"/>
-        </w:rPr>
-        <w:br/>
-      </w:r>
-      <w:r>
-        <w:rPr>
-          <w:rFonts w:ascii="Consolas" w:hAnsi="Consolas"/>
-          <w:sz w:val="19"/>
+          <w:rFonts w:ascii="Consolas" w:eastAsia="Consolas" w:hAnsi="Consolas" w:cs="Consolas"/>
+          <w:sz w:val="19"/>
+          <w:szCs w:val="19"/>
+        </w:rPr>
+        <w:br/>
+      </w:r>
+      <w:r>
+        <w:rPr>
+          <w:rFonts w:ascii="Consolas" w:eastAsia="Consolas" w:hAnsi="Consolas" w:cs="Consolas"/>
+          <w:sz w:val="19"/>
+          <w:szCs w:val="19"/>
+        </w:rPr>
+        <w:br/>
+      </w:r>
+      <w:r>
+        <w:rPr>
+          <w:rFonts w:ascii="Consolas" w:eastAsia="Consolas" w:hAnsi="Consolas" w:cs="Consolas"/>
+          <w:sz w:val="19"/>
+          <w:szCs w:val="19"/>
         </w:rPr>
         <w:lastRenderedPageBreak/>
         <w:t>Ausgang Optokoppler:</w:t>
       </w:r>
       <w:r>
         <w:rPr>
-          <w:rFonts w:ascii="Consolas" w:hAnsi="Consolas"/>
-          <w:sz w:val="19"/>
+          <w:rFonts w:ascii="Consolas" w:eastAsia="Consolas" w:hAnsi="Consolas" w:cs="Consolas"/>
+          <w:sz w:val="19"/>
+          <w:szCs w:val="19"/>
         </w:rPr>
         <w:br/>
         <w:t xml:space="preserve">  Optokoppler Pin 4 -&gt; Nikon-Stecker Pin 5+6 (FOCUS + SHUTTER)</w:t>
       </w:r>
       <w:r>
         <w:rPr>
-          <w:rFonts w:ascii="Consolas" w:hAnsi="Consolas"/>
-          <w:sz w:val="19"/>
+          <w:rFonts w:ascii="Consolas" w:eastAsia="Consolas" w:hAnsi="Consolas" w:cs="Consolas"/>
+          <w:sz w:val="19"/>
+          <w:szCs w:val="19"/>
         </w:rPr>
         <w:br/>
         <w:t xml:space="preserve">  Optokoppler Pin 3 -&gt; Nikon-Stecker Pin 3 (GND)</w:t>
@@ -6620,13 +6449,7 @@
         <w:spacing w:after="160"/>
       </w:pPr>
       <w:r>
-        <w:t xml:space="preserve">35 LEDs, angesteuert über SPI0 (GPIO 10 / Pin 19) mit der Bibliothek </w:t>
-      </w:r>
-      <w:r>
-        <w:t>neopixel_spi</w:t>
-      </w:r>
-      <w:r>
-        <w:t>. Eigenes 5V/5A-Netzteil für die Stromversorgung des Rings, über eine Diode leicht gedrosselt; 220-Ohm-Schutzwiderstand in der Datenleitung.</w:t>
+        <w:t>35 LEDs, angesteuert über SPI0 (GPIO 10 / Pin 19) mit der Bibliothek neopixel_spi. Eigenes 5V/5A-Netzteil für die Stromversorgung des Rings, über eine Diode leicht gedrosselt; 220-Ohm-Schutzwiderstand in der Datenleitung.</w:t>
       </w:r>
     </w:p>
     <w:p>
@@ -6636,187 +6459,143 @@
       </w:pPr>
       <w:r>
         <w:rPr>
-          <w:rFonts w:ascii="Consolas" w:hAnsi="Consolas"/>
-          <w:sz w:val="19"/>
+          <w:rFonts w:ascii="Consolas" w:eastAsia="Consolas" w:hAnsi="Consolas" w:cs="Consolas"/>
+          <w:sz w:val="19"/>
+          <w:szCs w:val="19"/>
         </w:rPr>
         <w:t>5V/5A Netzteil</w:t>
       </w:r>
       <w:r>
         <w:rPr>
-          <w:rFonts w:ascii="Consolas" w:hAnsi="Consolas"/>
-          <w:sz w:val="19"/>
+          <w:rFonts w:ascii="Consolas" w:eastAsia="Consolas" w:hAnsi="Consolas" w:cs="Consolas"/>
+          <w:sz w:val="19"/>
+          <w:szCs w:val="19"/>
         </w:rPr>
         <w:br/>
         <w:t>+--------+</w:t>
       </w:r>
       <w:r>
         <w:rPr>
-          <w:rFonts w:ascii="Consolas" w:hAnsi="Consolas"/>
-          <w:sz w:val="19"/>
-        </w:rPr>
-        <w:br/>
-        <w:t xml:space="preserve">| +5V    </w:t>
-      </w:r>
-      <w:r>
-        <w:rPr>
-          <w:rFonts w:ascii="Consolas" w:eastAsia="Consolas" w:hAnsi="Consolas" w:cs="Consolas"/>
-          <w:sz w:val="19"/>
-          <w:szCs w:val="19"/>
-        </w:rPr>
-        <w:t>|----[</w:t>
-      </w:r>
-      <w:r>
-        <w:rPr>
-          <w:rFonts w:ascii="Consolas" w:hAnsi="Consolas"/>
-          <w:sz w:val="19"/>
-        </w:rPr>
-        <w:t xml:space="preserve"> Diode: 1N4001 </w:t>
-      </w:r>
-      <w:r>
-        <w:rPr>
-          <w:rFonts w:ascii="Consolas" w:eastAsia="Consolas" w:hAnsi="Consolas" w:cs="Consolas"/>
-          <w:sz w:val="19"/>
-          <w:szCs w:val="19"/>
-        </w:rPr>
-        <w:t>]----&gt;</w:t>
-      </w:r>
-      <w:r>
-        <w:rPr>
-          <w:rFonts w:ascii="Consolas" w:hAnsi="Consolas"/>
-          <w:sz w:val="19"/>
-        </w:rPr>
-        <w:t xml:space="preserve"> Ring: +5V / VCC</w:t>
-      </w:r>
-      <w:r>
-        <w:rPr>
-          <w:rFonts w:ascii="Consolas" w:hAnsi="Consolas"/>
-          <w:sz w:val="19"/>
-        </w:rPr>
-        <w:br/>
-        <w:t xml:space="preserve">|        |   </w:t>
-      </w:r>
-      <w:r>
-        <w:rPr>
-          <w:rFonts w:ascii="Consolas" w:eastAsia="Consolas" w:hAnsi="Consolas" w:cs="Consolas"/>
-          <w:sz w:val="19"/>
-          <w:szCs w:val="19"/>
-        </w:rPr>
-        <w:t xml:space="preserve"> </w:t>
-      </w:r>
-      <w:r>
-        <w:rPr>
-          <w:rFonts w:ascii="Consolas" w:hAnsi="Consolas"/>
-          <w:sz w:val="19"/>
-        </w:rPr>
-        <w:t>(Kathode zeigt zum Ring!)</w:t>
-      </w:r>
-      <w:r>
-        <w:rPr>
-          <w:rFonts w:ascii="Consolas" w:hAnsi="Consolas"/>
-          <w:sz w:val="19"/>
+          <w:rFonts w:ascii="Consolas" w:eastAsia="Consolas" w:hAnsi="Consolas" w:cs="Consolas"/>
+          <w:sz w:val="19"/>
+          <w:szCs w:val="19"/>
+        </w:rPr>
+        <w:br/>
+        <w:t>| +5V    |----[ Diode: 1N4001 ]----&gt; Ring: +5V / VCC</w:t>
+      </w:r>
+      <w:r>
+        <w:rPr>
+          <w:rFonts w:ascii="Consolas" w:eastAsia="Consolas" w:hAnsi="Consolas" w:cs="Consolas"/>
+          <w:sz w:val="19"/>
+          <w:szCs w:val="19"/>
+        </w:rPr>
+        <w:br/>
+        <w:t>|        |    (Kathode zeigt zum Ring!)</w:t>
+      </w:r>
+      <w:r>
+        <w:rPr>
+          <w:rFonts w:ascii="Consolas" w:eastAsia="Consolas" w:hAnsi="Consolas" w:cs="Consolas"/>
+          <w:sz w:val="19"/>
+          <w:szCs w:val="19"/>
         </w:rPr>
         <w:br/>
         <w:t>|        |    [ Elko 470uF ] [ Kerko 100nF ] (parallel, am Ring)</w:t>
       </w:r>
       <w:r>
         <w:rPr>
-          <w:rFonts w:ascii="Consolas" w:hAnsi="Consolas"/>
-          <w:sz w:val="19"/>
+          <w:rFonts w:ascii="Consolas" w:eastAsia="Consolas" w:hAnsi="Consolas" w:cs="Consolas"/>
+          <w:sz w:val="19"/>
+          <w:szCs w:val="19"/>
         </w:rPr>
         <w:br/>
         <w:t>| GND    |----+</w:t>
       </w:r>
       <w:r>
         <w:rPr>
-          <w:rFonts w:ascii="Consolas" w:hAnsi="Consolas"/>
-          <w:sz w:val="19"/>
+          <w:rFonts w:ascii="Consolas" w:eastAsia="Consolas" w:hAnsi="Consolas" w:cs="Consolas"/>
+          <w:sz w:val="19"/>
+          <w:szCs w:val="19"/>
         </w:rPr>
         <w:br/>
         <w:t>+--------+    |</w:t>
       </w:r>
       <w:r>
         <w:rPr>
-          <w:rFonts w:ascii="Consolas" w:hAnsi="Consolas"/>
-          <w:sz w:val="19"/>
+          <w:rFonts w:ascii="Consolas" w:eastAsia="Consolas" w:hAnsi="Consolas" w:cs="Consolas"/>
+          <w:sz w:val="19"/>
+          <w:szCs w:val="19"/>
         </w:rPr>
         <w:br/>
         <w:t xml:space="preserve">              |</w:t>
       </w:r>
       <w:r>
         <w:rPr>
-          <w:rFonts w:ascii="Consolas" w:hAnsi="Consolas"/>
-          <w:sz w:val="19"/>
+          <w:rFonts w:ascii="Consolas" w:eastAsia="Consolas" w:hAnsi="Consolas" w:cs="Consolas"/>
+          <w:sz w:val="19"/>
+          <w:szCs w:val="19"/>
         </w:rPr>
         <w:br/>
         <w:t>Raspberry Pi 5|</w:t>
       </w:r>
       <w:r>
         <w:rPr>
-          <w:rFonts w:ascii="Consolas" w:hAnsi="Consolas"/>
-          <w:sz w:val="19"/>
+          <w:rFonts w:ascii="Consolas" w:eastAsia="Consolas" w:hAnsi="Consolas" w:cs="Consolas"/>
+          <w:sz w:val="19"/>
+          <w:szCs w:val="19"/>
         </w:rPr>
         <w:br/>
         <w:t>+--------+    |</w:t>
       </w:r>
       <w:r>
         <w:rPr>
-          <w:rFonts w:ascii="Consolas" w:hAnsi="Consolas"/>
-          <w:sz w:val="19"/>
-        </w:rPr>
-        <w:br/>
-        <w:t xml:space="preserve">| GND    </w:t>
-      </w:r>
-      <w:r>
-        <w:rPr>
-          <w:rFonts w:ascii="Consolas" w:eastAsia="Consolas" w:hAnsi="Consolas" w:cs="Consolas"/>
-          <w:sz w:val="19"/>
-          <w:szCs w:val="19"/>
-        </w:rPr>
-        <w:t>|----+----------------------------------&gt;</w:t>
-      </w:r>
-      <w:r>
-        <w:rPr>
-          <w:rFonts w:ascii="Consolas" w:hAnsi="Consolas"/>
-          <w:sz w:val="19"/>
-        </w:rPr>
-        <w:t xml:space="preserve"> Ring: GND</w:t>
-      </w:r>
-      <w:r>
-        <w:rPr>
-          <w:rFonts w:ascii="Consolas" w:hAnsi="Consolas"/>
-          <w:sz w:val="19"/>
+          <w:rFonts w:ascii="Consolas" w:eastAsia="Consolas" w:hAnsi="Consolas" w:cs="Consolas"/>
+          <w:sz w:val="19"/>
+          <w:szCs w:val="19"/>
+        </w:rPr>
+        <w:br/>
+        <w:t>| GND    |----+----------------------------------&gt; Ring: GND</w:t>
+      </w:r>
+      <w:r>
+        <w:rPr>
+          <w:rFonts w:ascii="Consolas" w:eastAsia="Consolas" w:hAnsi="Consolas" w:cs="Consolas"/>
+          <w:sz w:val="19"/>
+          <w:szCs w:val="19"/>
         </w:rPr>
         <w:br/>
         <w:t>| (Pin20)|</w:t>
       </w:r>
       <w:r>
         <w:rPr>
-          <w:rFonts w:ascii="Consolas" w:hAnsi="Consolas"/>
-          <w:sz w:val="19"/>
+          <w:rFonts w:ascii="Consolas" w:eastAsia="Consolas" w:hAnsi="Consolas" w:cs="Consolas"/>
+          <w:sz w:val="19"/>
+          <w:szCs w:val="19"/>
         </w:rPr>
         <w:br/>
         <w:t>|        |</w:t>
       </w:r>
       <w:r>
         <w:rPr>
-          <w:rFonts w:ascii="Consolas" w:hAnsi="Consolas"/>
-          <w:sz w:val="19"/>
+          <w:rFonts w:ascii="Consolas" w:eastAsia="Consolas" w:hAnsi="Consolas" w:cs="Consolas"/>
+          <w:sz w:val="19"/>
+          <w:szCs w:val="19"/>
         </w:rPr>
         <w:br/>
         <w:t>| GPIO10 |-----[ 220 Ohm ]------------------------&gt; Ring: DI (Data Input)</w:t>
       </w:r>
       <w:r>
         <w:rPr>
-          <w:rFonts w:ascii="Consolas" w:hAnsi="Consolas"/>
-          <w:sz w:val="19"/>
+          <w:rFonts w:ascii="Consolas" w:eastAsia="Consolas" w:hAnsi="Consolas" w:cs="Consolas"/>
+          <w:sz w:val="19"/>
+          <w:szCs w:val="19"/>
         </w:rPr>
         <w:br/>
         <w:t>| (Pin19)|</w:t>
       </w:r>
       <w:r>
         <w:rPr>
-          <w:rFonts w:ascii="Consolas" w:hAnsi="Consolas"/>
-          <w:sz w:val="19"/>
+          <w:rFonts w:ascii="Consolas" w:eastAsia="Consolas" w:hAnsi="Consolas" w:cs="Consolas"/>
+          <w:sz w:val="19"/>
+          <w:szCs w:val="19"/>
         </w:rPr>
         <w:br/>
         <w:t>+--------+</w:t>
@@ -6858,13 +6637,7 @@
         <w:spacing w:after="90"/>
       </w:pPr>
       <w:r>
-        <w:t>Datenfluss: Pi GPIO 10 → 220</w:t>
-      </w:r>
-      <w:r>
-        <w:t>-</w:t>
-      </w:r>
-      <w:r>
-        <w:t>Ohm-Widerstand → Ring DI.</w:t>
+        <w:t>Datenfluss: Pi GPIO 10 → 220-Ohm-Widerstand → Ring DI.</w:t>
       </w:r>
     </w:p>
     <w:p>
@@ -6899,7 +6672,7 @@
         <w:spacing w:after="90"/>
       </w:pPr>
       <w:r>
-        <w:t>Modus: A (Zeitautomatik/Blendenautomatik) - Blende wird vorgegeben, die Kamera berechnet die Belichtungszeit selbst; geändert in der Sprint-11-Nachbesserung, vorher M/Manuell</w:t>
+        <w:t>Modus: M (Manuell)</w:t>
       </w:r>
     </w:p>
     <w:p>
@@ -6966,61 +6739,7 @@
           <w:sz w:val="21"/>
           <w:szCs w:val="21"/>
         </w:rPr>
-        <w:t xml:space="preserve">Hinweis (Sprint 11): ISO und Blende lassen sich seither direkt über das Service-Menü („Kamera-Einstellungen“) über die bestehende USB-Verbindung anpassen, ohne die Kamera aus dem Gehäuse zu nehmen und Kabel zu lösen (siehe hw_camera_settings_provider.py sowie das Kapitel „Service-/Admin-Menü“). Voraussetzung </w:t>
-      </w:r>
-      <w:r>
-        <w:rPr>
-          <w:i/>
-          <w:iCs/>
-          <w:sz w:val="21"/>
-          <w:szCs w:val="21"/>
-        </w:rPr>
-        <w:t>ist ein Modus,</w:t>
-      </w:r>
-      <w:r>
-        <w:rPr>
-          <w:i/>
-          <w:iCs/>
-          <w:sz w:val="21"/>
-          <w:szCs w:val="21"/>
-        </w:rPr>
-        <w:t xml:space="preserve"> der </w:t>
-      </w:r>
-      <w:r>
-        <w:rPr>
-          <w:i/>
-          <w:iCs/>
-          <w:sz w:val="21"/>
-          <w:szCs w:val="21"/>
-        </w:rPr>
-        <w:t>eine manuelle Blendenwahl zulässt (A oder</w:t>
-      </w:r>
-      <w:r>
-        <w:rPr>
-          <w:i/>
-          <w:iCs/>
-          <w:sz w:val="21"/>
-          <w:szCs w:val="21"/>
-        </w:rPr>
-        <w:t xml:space="preserve"> M;</w:t>
-      </w:r>
-      <w:r>
-        <w:rPr>
-          <w:i/>
-          <w:iCs/>
-          <w:sz w:val="21"/>
-          <w:szCs w:val="21"/>
-        </w:rPr>
-        <w:t xml:space="preserve"> seit der Sprint-11-Nachbesserung wird A/Zeitautomatik genutzt);</w:t>
-      </w:r>
-      <w:r>
-        <w:rPr>
-          <w:i/>
-          <w:iCs/>
-          <w:sz w:val="21"/>
-          <w:szCs w:val="21"/>
-        </w:rPr>
-        <w:t xml:space="preserve"> der gültige Blenden-Wertebereich hängt vom montierten Objektiv ab und wird live von der Kamera gelesen, nie hartkodiert.</w:t>
+        <w:t>Hinweis (Sprint 11): ISO und Blende lassen sich seither direkt über das Service-Menü („Kamera-Einstellungen“) über die bestehende USB-Verbindung anpassen, ohne die Kamera aus dem Gehäuse zu nehmen und Kabel zu lösen (siehe hw_camera_settings_provider.py sowie das Kapitel „Service-/Admin-Menü“). Voraussetzung bleibt weiterhin der Modus M; der gültige Blenden-Wertebereich hängt vom montierten Objektiv ab und wird live von der Kamera gelesen, nie hartkodiert.</w:t>
       </w:r>
     </w:p>
     <w:p>
@@ -7041,7 +6760,7 @@
           <w:noProof/>
         </w:rPr>
         <w:drawing>
-          <wp:inline distT="0" distB="0" distL="0" distR="0" wp14:anchorId="210A2DF4" wp14:editId="568F0236">
+          <wp:inline distT="0" distB="0" distL="0" distR="0" wp14:anchorId="176C8A2C" wp14:editId="6D50328D">
             <wp:extent cx="3619500" cy="2714625"/>
             <wp:effectExtent l="0" t="0" r="0" b="0"/>
             <wp:docPr id="1528579807" name="Grafik 1528579807" descr="Ein Bild, das Text, Screenshot, Multimedia-Software, Software enthält.&#10;&#10;KI-generierte Inhalte können fehlerhaft sein."/>
@@ -7091,8 +6810,10 @@
       <w:r>
         <w:rPr>
           <w:i/>
+          <w:iCs/>
           <w:color w:val="555555"/>
           <w:sz w:val="18"/>
+          <w:szCs w:val="18"/>
           <w:lang w:val="en-US"/>
         </w:rPr>
         <w:t>MC-DC2-Stecker (Quelle: nikonites.com/forum/threads/help-with-plug.41380)</w:t>
@@ -7175,7 +6896,7 @@
         </w:rPr>
         <w:lastRenderedPageBreak/>
         <w:drawing>
-          <wp:inline distT="0" distB="0" distL="0" distR="0" wp14:anchorId="58897CEA" wp14:editId="4754B8A5">
+          <wp:inline distT="0" distB="0" distL="0" distR="0" wp14:anchorId="4B2090BF" wp14:editId="38B032ED">
             <wp:extent cx="2095500" cy="4429125"/>
             <wp:effectExtent l="0" t="0" r="0" b="0"/>
             <wp:docPr id="1386816165" name="Grafik 1386816165" descr="Ein Bild, das Text, Screenshot, Diagramm, Schrift enthält.&#10;&#10;KI-generierte Inhalte können fehlerhaft sein."/>
@@ -7227,67 +6948,7 @@
           <w:sz w:val="18"/>
           <w:szCs w:val="18"/>
         </w:rPr>
-        <w:t xml:space="preserve">Verdrahtung Nikon D3300 – Optokoppler – Raspberry. Im Bild sind 470 </w:t>
-      </w:r>
-      <w:r>
-        <w:rPr>
-          <w:i/>
-          <w:iCs/>
-          <w:color w:val="555555"/>
-          <w:sz w:val="18"/>
-          <w:szCs w:val="18"/>
-        </w:rPr>
-        <w:t>Ω</w:t>
-      </w:r>
-      <w:r>
-        <w:rPr>
-          <w:i/>
-          <w:iCs/>
-          <w:color w:val="555555"/>
-          <w:sz w:val="18"/>
-          <w:szCs w:val="18"/>
-        </w:rPr>
-        <w:t xml:space="preserve"> eingezeichnet</w:t>
-      </w:r>
-      <w:r>
-        <w:rPr>
-          <w:i/>
-          <w:iCs/>
-          <w:color w:val="555555"/>
-          <w:sz w:val="18"/>
-          <w:szCs w:val="18"/>
-        </w:rPr>
-        <w:t xml:space="preserve"> —</w:t>
-      </w:r>
-      <w:r>
-        <w:rPr>
-          <w:i/>
-          <w:iCs/>
-          <w:color w:val="555555"/>
-          <w:sz w:val="18"/>
-          <w:szCs w:val="18"/>
-        </w:rPr>
-        <w:t xml:space="preserve"> tatsächlich verwendet: 220 </w:t>
-      </w:r>
-      <w:r>
-        <w:rPr>
-          <w:i/>
-          <w:iCs/>
-          <w:color w:val="555555"/>
-          <w:sz w:val="18"/>
-          <w:szCs w:val="18"/>
-        </w:rPr>
-        <w:t>Ω</w:t>
-      </w:r>
-      <w:r>
-        <w:rPr>
-          <w:i/>
-          <w:iCs/>
-          <w:color w:val="555555"/>
-          <w:sz w:val="18"/>
-          <w:szCs w:val="18"/>
-        </w:rPr>
-        <w:t xml:space="preserve"> (siehe GPIO-Kapitel).</w:t>
+        <w:t>Verdrahtung Nikon D3300 – Optokoppler – Raspberry. Im Bild sind 470 Ω eingezeichnet — tatsächlich verwendet: 220 Ω (siehe GPIO-Kapitel).</w:t>
       </w:r>
     </w:p>
     <w:p>
@@ -7316,7 +6977,7 @@
           <w:noProof/>
         </w:rPr>
         <w:drawing>
-          <wp:inline distT="0" distB="0" distL="0" distR="0" wp14:anchorId="244DAC49" wp14:editId="183C626B">
+          <wp:inline distT="0" distB="0" distL="0" distR="0" wp14:anchorId="162BDCB2" wp14:editId="5A9E708F">
             <wp:extent cx="2667000" cy="1857375"/>
             <wp:effectExtent l="0" t="0" r="0" b="0"/>
             <wp:docPr id="415783414" name="Grafik 415783414" descr="Ein Bild, das Gerät, Elektronisches Gerät, Multimedia, Text enthält.&#10;&#10;KI-generierte Inhalte können fehlerhaft sein."/>
@@ -7365,7 +7026,7 @@
           <w:noProof/>
         </w:rPr>
         <w:drawing>
-          <wp:inline distT="0" distB="0" distL="0" distR="0" wp14:anchorId="254904E7" wp14:editId="5F98597E">
+          <wp:inline distT="0" distB="0" distL="0" distR="0" wp14:anchorId="40BAB8E3" wp14:editId="0B50FC36">
             <wp:extent cx="2667000" cy="1943100"/>
             <wp:effectExtent l="0" t="0" r="0" b="0"/>
             <wp:docPr id="26574583" name="Grafik 26574583" descr="Ein Bild, das Text, Screenshot, Spielstandanzeige, Zahl enthält.&#10;&#10;KI-generierte Inhalte können fehlerhaft sein."/>
@@ -7447,7 +7108,7 @@
           <w:noProof/>
         </w:rPr>
         <w:drawing>
-          <wp:inline distT="0" distB="0" distL="0" distR="0" wp14:anchorId="2C161FCE" wp14:editId="72AE2092">
+          <wp:inline distT="0" distB="0" distL="0" distR="0" wp14:anchorId="61AB80DB" wp14:editId="3CE86A6D">
             <wp:extent cx="2857500" cy="2000250"/>
             <wp:effectExtent l="0" t="0" r="0" b="0"/>
             <wp:docPr id="260381689" name="Grafik 260381689" descr="Ein Bild, das Auto, Kamera enthält.&#10;&#10;KI-generierte Inhalte können fehlerhaft sein."/>
@@ -7520,7 +7181,7 @@
           <w:noProof/>
         </w:rPr>
         <w:drawing>
-          <wp:inline distT="0" distB="0" distL="0" distR="0" wp14:anchorId="06FC572B" wp14:editId="1D246D2A">
+          <wp:inline distT="0" distB="0" distL="0" distR="0" wp14:anchorId="10CF27A0" wp14:editId="3B47A406">
             <wp:extent cx="2857500" cy="1962150"/>
             <wp:effectExtent l="0" t="0" r="0" b="0"/>
             <wp:docPr id="301401528" name="Grafik 301401528" descr="Ein Bild, das Gamecontroller, Joystick, Elektronisches Gerät, Gerät enthält.&#10;&#10;KI-generierte Inhalte können fehlerhaft sein."/>
@@ -7569,7 +7230,7 @@
           <w:noProof/>
         </w:rPr>
         <w:drawing>
-          <wp:inline distT="0" distB="0" distL="0" distR="0" wp14:anchorId="77716CAF" wp14:editId="197C9BEF">
+          <wp:inline distT="0" distB="0" distL="0" distR="0" wp14:anchorId="244AA0FB" wp14:editId="466C5E82">
             <wp:extent cx="2476500" cy="1857375"/>
             <wp:effectExtent l="0" t="0" r="0" b="0"/>
             <wp:docPr id="1075318647" name="Grafik 1075318647" descr="Ein Bild, das Text, Screenshot, Multimedia, Medien enthält.&#10;&#10;KI-generierte Inhalte können fehlerhaft sein."/>
@@ -7643,7 +7304,7 @@
           <w:noProof/>
         </w:rPr>
         <w:drawing>
-          <wp:inline distT="0" distB="0" distL="0" distR="0" wp14:anchorId="64C3D85D" wp14:editId="5C76D1BA">
+          <wp:inline distT="0" distB="0" distL="0" distR="0" wp14:anchorId="6F82A155" wp14:editId="46728362">
             <wp:extent cx="2476500" cy="2476500"/>
             <wp:effectExtent l="0" t="0" r="0" b="0"/>
             <wp:docPr id="230432739" name="Grafik 230432739" descr="Ein Bild, das Schwarz, Dunkelheit enthält.&#10;&#10;KI-generierte Inhalte können fehlerhaft sein."/>
@@ -7727,19 +7388,7 @@
         <w:spacing w:after="160"/>
       </w:pPr>
       <w:r>
-        <w:t xml:space="preserve">Die Live-Vorschau läuft stattdessen über </w:t>
-      </w:r>
-      <w:r>
-        <w:t xml:space="preserve">gphoto2s capture_preview() </w:t>
-      </w:r>
-      <w:r>
-        <w:t xml:space="preserve">via USB (siehe </w:t>
-      </w:r>
-      <w:r>
-        <w:t>hw_gphoto2_preview_provider.py</w:t>
-      </w:r>
-      <w:r>
-        <w:t>) – ca. 640×424 JPEG-Frames bei ~8 fps, weniger flüssig als HDMI, aber für den Fotobox-Einsatz ausreichend.</w:t>
+        <w:t>Die Live-Vorschau läuft stattdessen über gphoto2s capture_preview() via USB (siehe hw_gphoto2_preview_provider.py) – ca. 640×424 JPEG-Frames bei ~8 fps, weniger flüssig als HDMI, aber für den Fotobox-Einsatz ausreichend.</w:t>
       </w:r>
     </w:p>
     <w:p>
@@ -7761,19 +7410,7 @@
         <w:spacing w:after="160"/>
       </w:pPr>
       <w:r>
-        <w:t>Vollständige Absicherungsmaßnahmen (</w:t>
-      </w:r>
-      <w:r>
-        <w:t>fail2ban</w:t>
-      </w:r>
-      <w:r>
-        <w:t xml:space="preserve">, SSH-Härtung, Update-Benachrichtigung) siehe </w:t>
-      </w:r>
-      <w:r>
-        <w:t>README.md</w:t>
-      </w:r>
-      <w:r>
-        <w:t>, Kapitel „Sicherheit / Härtung“ — hier die Kernkonfiguration zur Referenz beim Verkabeln/Einrichten neuer Hardware.</w:t>
+        <w:t>Vollständige Absicherungsmaßnahmen (fail2ban, SSH-Härtung, Update-Benachrichtigung) siehe README.md, Kapitel „Sicherheit / Härtung“ — hier die Kernkonfiguration zur Referenz beim Verkabeln/Einrichten neuer Hardware.</w:t>
       </w:r>
     </w:p>
     <w:p>
@@ -8169,7 +7806,7 @@
           <w:noProof/>
         </w:rPr>
         <w:drawing>
-          <wp:inline distT="0" distB="0" distL="0" distR="0" wp14:anchorId="4DA41E40" wp14:editId="5558A55C">
+          <wp:inline distT="0" distB="0" distL="0" distR="0" wp14:anchorId="6301C815" wp14:editId="32271E7E">
             <wp:extent cx="4000500" cy="1666875"/>
             <wp:effectExtent l="0" t="0" r="0" b="0"/>
             <wp:docPr id="1572401057" name="Grafik 1572401057" descr="Ein Bild, das Text, Screenshot, Schrift, Software enthält.&#10;&#10;KI-generierte Inhalte können fehlerhaft sein."/>
@@ -8234,7 +7871,7 @@
           <w:noProof/>
         </w:rPr>
         <w:drawing>
-          <wp:inline distT="0" distB="0" distL="0" distR="0" wp14:anchorId="46F6966F" wp14:editId="7CF60AB8">
+          <wp:inline distT="0" distB="0" distL="0" distR="0" wp14:anchorId="15635D65" wp14:editId="2002B2F3">
             <wp:extent cx="4000500" cy="409575"/>
             <wp:effectExtent l="0" t="0" r="0" b="0"/>
             <wp:docPr id="1545347845" name="Grafik 1545347845"/>
@@ -8563,14 +8200,6 @@
         <w:gridCol w:w="1800"/>
         <w:gridCol w:w="3100"/>
         <w:gridCol w:w="3500"/>
-        <w:tblGridChange w:id="0">
-          <w:tblGrid>
-            <w:gridCol w:w="1400"/>
-            <w:gridCol w:w="1800"/>
-            <w:gridCol w:w="3100"/>
-            <w:gridCol w:w="3500"/>
-          </w:tblGrid>
-        </w:tblGridChange>
       </w:tblGrid>
       <w:tr>
         <w:trPr>
@@ -9086,13 +8715,7 @@
         <w:spacing w:after="160"/>
       </w:pPr>
       <w:r>
-        <w:t xml:space="preserve">VNC für den Admin-Laptop bewusst nicht als eigene </w:t>
-      </w:r>
-      <w:r>
-        <w:t>ufw</w:t>
-      </w:r>
-      <w:r>
-        <w:t>-Regel auf Port 5900 freigegeben, sondern per SSH-Tunnel über den bereits offenen Port 22 gefahren:</w:t>
+        <w:t>VNC für den Admin-Laptop bewusst nicht als eigene ufw-Regel auf Port 5900 freigegeben, sondern per SSH-Tunnel über den bereits offenen Port 22 gefahren:</w:t>
       </w:r>
     </w:p>
     <w:p>
@@ -9102,15 +8725,17 @@
       </w:pPr>
       <w:r>
         <w:rPr>
-          <w:rFonts w:ascii="Consolas" w:hAnsi="Consolas"/>
-          <w:sz w:val="19"/>
+          <w:rFonts w:ascii="Consolas" w:eastAsia="Consolas" w:hAnsi="Consolas" w:cs="Consolas"/>
+          <w:sz w:val="19"/>
+          <w:szCs w:val="19"/>
         </w:rPr>
         <w:t>ssh -L 5901:localhost:5900 photobox@192.168.0.10</w:t>
       </w:r>
       <w:r>
         <w:rPr>
-          <w:rFonts w:ascii="Consolas" w:hAnsi="Consolas"/>
-          <w:sz w:val="19"/>
+          <w:rFonts w:ascii="Consolas" w:eastAsia="Consolas" w:hAnsi="Consolas" w:cs="Consolas"/>
+          <w:sz w:val="19"/>
+          <w:szCs w:val="19"/>
         </w:rPr>
         <w:br/>
         <w:t># danach VNC-Viewer gegen localhost:5901 verbinden</w:t>
@@ -9757,22 +9382,7 @@
           <w:szCs w:val="19"/>
         </w:rPr>
         <w:br/>
-        <w:t xml:space="preserve">├── </w:t>
-      </w:r>
-      <w:r>
-        <w:rPr>
-          <w:rFonts w:ascii="Consolas" w:hAnsi="Consolas"/>
-          <w:sz w:val="19"/>
-        </w:rPr>
-        <w:t>hw_grabber_provider.py</w:t>
-      </w:r>
-      <w:r>
-        <w:rPr>
-          <w:rFonts w:ascii="Consolas" w:eastAsia="Consolas" w:hAnsi="Consolas" w:cs="Consolas"/>
-          <w:sz w:val="19"/>
-          <w:szCs w:val="19"/>
-        </w:rPr>
-        <w:t xml:space="preserve">    # (nicht mehr verwendet - HDMI-Grabber verworfen)</w:t>
+        <w:t>├── hw_grabber_provider.py    # (nicht mehr verwendet - HDMI-Grabber verworfen)</w:t>
       </w:r>
       <w:r>
         <w:rPr>

</xml_diff>